<commit_message>
ArrayList topic day-2 addedd
</commit_message>
<xml_diff>
--- a/productBasedPreparation/Java/collections/CollectionsInterviewQuestions.docx
+++ b/productBasedPreparation/Java/collections/CollectionsInterviewQuestions.docx
@@ -445,6 +445,12 @@
     <w:p>
       <w:pPr>
         <w:pStyle w:val="ListParagraph"/>
+        <w:rPr>
+          <w:rFonts w:ascii="Times New Roman" w:eastAsia="Times New Roman" w:hAnsi="Times New Roman" w:cs="Times New Roman"/>
+          <w:kern w:val="0"/>
+          <w:lang w:eastAsia="en-IN"/>
+          <w14:ligatures w14:val="none"/>
+        </w:rPr>
       </w:pPr>
       <w:proofErr w:type="gramStart"/>
       <w:r>
@@ -486,6 +492,3757 @@
         </w:rPr>
         <w:t xml:space="preserve"> → Employee ID → Employee Name.</w:t>
       </w:r>
+    </w:p>
+    <w:p>
+      <w:pPr>
+        <w:pStyle w:val="ListParagraph"/>
+        <w:rPr>
+          <w:rFonts w:ascii="Times New Roman" w:eastAsia="Times New Roman" w:hAnsi="Times New Roman" w:cs="Times New Roman"/>
+          <w:kern w:val="0"/>
+          <w:lang w:eastAsia="en-IN"/>
+          <w14:ligatures w14:val="none"/>
+        </w:rPr>
+      </w:pPr>
+    </w:p>
+    <w:p>
+      <w:pPr>
+        <w:pStyle w:val="ListParagraph"/>
+        <w:rPr>
+          <w:rFonts w:ascii="Times New Roman" w:eastAsia="Times New Roman" w:hAnsi="Times New Roman" w:cs="Times New Roman"/>
+          <w:kern w:val="0"/>
+          <w:lang w:eastAsia="en-IN"/>
+          <w14:ligatures w14:val="none"/>
+        </w:rPr>
+      </w:pPr>
+    </w:p>
+    <w:p>
+      <w:pPr>
+        <w:pStyle w:val="ListParagraph"/>
+        <w:rPr>
+          <w:rFonts w:ascii="Times New Roman" w:eastAsia="Times New Roman" w:hAnsi="Times New Roman" w:cs="Times New Roman"/>
+          <w:kern w:val="0"/>
+          <w:lang w:eastAsia="en-IN"/>
+          <w14:ligatures w14:val="none"/>
+        </w:rPr>
+      </w:pPr>
+    </w:p>
+    <w:p>
+      <w:pPr>
+        <w:pStyle w:val="ListParagraph"/>
+        <w:rPr>
+          <w:rFonts w:ascii="Times New Roman" w:eastAsia="Times New Roman" w:hAnsi="Times New Roman" w:cs="Times New Roman"/>
+          <w:kern w:val="0"/>
+          <w:lang w:eastAsia="en-IN"/>
+          <w14:ligatures w14:val="none"/>
+        </w:rPr>
+      </w:pPr>
+    </w:p>
+    <w:p>
+      <w:pPr>
+        <w:pStyle w:val="ListParagraph"/>
+        <w:rPr>
+          <w:b/>
+          <w:bCs/>
+        </w:rPr>
+      </w:pPr>
+      <w:r>
+        <w:rPr>
+          <w:b/>
+          <w:bCs/>
+        </w:rPr>
+        <w:lastRenderedPageBreak/>
+        <w:t xml:space="preserve">1. What is </w:t>
+      </w:r>
+      <w:proofErr w:type="spellStart"/>
+      <w:r>
+        <w:rPr>
+          <w:b/>
+          <w:bCs/>
+        </w:rPr>
+        <w:t>ArrayList</w:t>
+      </w:r>
+      <w:proofErr w:type="spellEnd"/>
+      <w:r>
+        <w:rPr>
+          <w:b/>
+          <w:bCs/>
+        </w:rPr>
+        <w:t>?</w:t>
+      </w:r>
+    </w:p>
+    <w:p>
+      <w:pPr>
+        <w:pStyle w:val="ListParagraph"/>
+      </w:pPr>
+      <w:r>
+        <w:rPr>
+          <w:b/>
+          <w:bCs/>
+        </w:rPr>
+        <w:t>Answer:</w:t>
+      </w:r>
+    </w:p>
+    <w:p>
+      <w:pPr>
+        <w:pStyle w:val="ListParagraph"/>
+      </w:pPr>
+      <w:proofErr w:type="spellStart"/>
+      <w:r>
+        <w:t>ArrayList</w:t>
+      </w:r>
+      <w:proofErr w:type="spellEnd"/>
+      <w:r>
+        <w:t xml:space="preserve"> is a class in the Java Collections Framework that implements the </w:t>
+      </w:r>
+      <w:r>
+        <w:rPr>
+          <w:b/>
+          <w:bCs/>
+        </w:rPr>
+        <w:t>List</w:t>
+      </w:r>
+      <w:r>
+        <w:t xml:space="preserve"> interface. It stores elements in insertion order, allows duplicate elements, and grows dynamically as elements are added.</w:t>
+      </w:r>
+    </w:p>
+    <w:p>
+      <w:pPr>
+        <w:pStyle w:val="ListParagraph"/>
+      </w:pPr>
+    </w:p>
+    <w:p>
+      <w:pPr>
+        <w:pStyle w:val="ListParagraph"/>
+        <w:rPr>
+          <w:b/>
+          <w:bCs/>
+        </w:rPr>
+      </w:pPr>
+      <w:r>
+        <w:rPr>
+          <w:b/>
+          <w:bCs/>
+        </w:rPr>
+        <w:t xml:space="preserve">2. Why do we use </w:t>
+      </w:r>
+      <w:proofErr w:type="spellStart"/>
+      <w:r>
+        <w:rPr>
+          <w:b/>
+          <w:bCs/>
+        </w:rPr>
+        <w:t>ArrayList</w:t>
+      </w:r>
+      <w:proofErr w:type="spellEnd"/>
+      <w:r>
+        <w:rPr>
+          <w:b/>
+          <w:bCs/>
+        </w:rPr>
+        <w:t>?</w:t>
+      </w:r>
+    </w:p>
+    <w:p>
+      <w:pPr>
+        <w:pStyle w:val="ListParagraph"/>
+      </w:pPr>
+      <w:r>
+        <w:rPr>
+          <w:b/>
+          <w:bCs/>
+        </w:rPr>
+        <w:t>Answer:</w:t>
+      </w:r>
+    </w:p>
+    <w:p>
+      <w:pPr>
+        <w:pStyle w:val="ListParagraph"/>
+        <w:numPr>
+          <w:ilvl w:val="0"/>
+          <w:numId w:val="2"/>
+        </w:numPr>
+      </w:pPr>
+      <w:r>
+        <w:t xml:space="preserve">Dynamic size </w:t>
+      </w:r>
+    </w:p>
+    <w:p>
+      <w:pPr>
+        <w:pStyle w:val="ListParagraph"/>
+        <w:numPr>
+          <w:ilvl w:val="0"/>
+          <w:numId w:val="2"/>
+        </w:numPr>
+      </w:pPr>
+      <w:r>
+        <w:t xml:space="preserve">Easy insertion and deletion </w:t>
+      </w:r>
+    </w:p>
+    <w:p>
+      <w:pPr>
+        <w:pStyle w:val="ListParagraph"/>
+        <w:numPr>
+          <w:ilvl w:val="0"/>
+          <w:numId w:val="2"/>
+        </w:numPr>
+      </w:pPr>
+      <w:r>
+        <w:t xml:space="preserve">Provides many built-in methods </w:t>
+      </w:r>
+    </w:p>
+    <w:p>
+      <w:pPr>
+        <w:pStyle w:val="ListParagraph"/>
+        <w:numPr>
+          <w:ilvl w:val="0"/>
+          <w:numId w:val="2"/>
+        </w:numPr>
+      </w:pPr>
+      <w:r>
+        <w:t>Maintains insertion order</w:t>
+      </w:r>
+    </w:p>
+    <w:p>
+      <w:pPr>
+        <w:pStyle w:val="ListParagraph"/>
+      </w:pPr>
+    </w:p>
+    <w:p>
+      <w:pPr>
+        <w:pStyle w:val="ListParagraph"/>
+        <w:rPr>
+          <w:b/>
+          <w:bCs/>
+        </w:rPr>
+      </w:pPr>
+      <w:r>
+        <w:rPr>
+          <w:b/>
+          <w:bCs/>
+        </w:rPr>
+        <w:t xml:space="preserve">3. Does </w:t>
+      </w:r>
+      <w:proofErr w:type="spellStart"/>
+      <w:r>
+        <w:rPr>
+          <w:b/>
+          <w:bCs/>
+        </w:rPr>
+        <w:t>ArrayList</w:t>
+      </w:r>
+      <w:proofErr w:type="spellEnd"/>
+      <w:r>
+        <w:rPr>
+          <w:b/>
+          <w:bCs/>
+        </w:rPr>
+        <w:t xml:space="preserve"> allow duplicate elements?</w:t>
+      </w:r>
+    </w:p>
+    <w:p>
+      <w:pPr>
+        <w:pStyle w:val="ListParagraph"/>
+      </w:pPr>
+      <w:r>
+        <w:rPr>
+          <w:b/>
+          <w:bCs/>
+        </w:rPr>
+        <w:t>Answer:</w:t>
+      </w:r>
+    </w:p>
+    <w:p>
+      <w:pPr>
+        <w:pStyle w:val="ListParagraph"/>
+      </w:pPr>
+      <w:r>
+        <w:rPr>
+          <w:rFonts w:ascii="Segoe UI Emoji" w:hAnsi="Segoe UI Emoji" w:cs="Segoe UI Emoji"/>
+        </w:rPr>
+        <w:t>✅</w:t>
+      </w:r>
+      <w:r>
+        <w:t xml:space="preserve"> Yes.</w:t>
+      </w:r>
+    </w:p>
+    <w:p>
+      <w:pPr>
+        <w:pStyle w:val="ListParagraph"/>
+      </w:pPr>
+      <w:r>
+        <w:t>Example:</w:t>
+      </w:r>
+    </w:p>
+    <w:p>
+      <w:pPr>
+        <w:pStyle w:val="ListParagraph"/>
+      </w:pPr>
+      <w:proofErr w:type="spellStart"/>
+      <w:r>
+        <w:t>ArrayList</w:t>
+      </w:r>
+      <w:proofErr w:type="spellEnd"/>
+      <w:r>
+        <w:t xml:space="preserve">&lt;String&gt; list = new </w:t>
+      </w:r>
+      <w:proofErr w:type="spellStart"/>
+      <w:r>
+        <w:t>ArrayList</w:t>
+      </w:r>
+      <w:proofErr w:type="spellEnd"/>
+      <w:r>
+        <w:t>&lt;</w:t>
+      </w:r>
+      <w:proofErr w:type="gramStart"/>
+      <w:r>
+        <w:t>&gt;(</w:t>
+      </w:r>
+      <w:proofErr w:type="gramEnd"/>
+      <w:r>
+        <w:t>);</w:t>
+      </w:r>
+    </w:p>
+    <w:p>
+      <w:pPr>
+        <w:pStyle w:val="ListParagraph"/>
+      </w:pPr>
+    </w:p>
+    <w:p>
+      <w:pPr>
+        <w:pStyle w:val="ListParagraph"/>
+      </w:pPr>
+      <w:proofErr w:type="spellStart"/>
+      <w:r>
+        <w:t>list.add</w:t>
+      </w:r>
+      <w:proofErr w:type="spellEnd"/>
+      <w:r>
+        <w:t>("Java");</w:t>
+      </w:r>
+    </w:p>
+    <w:p>
+      <w:pPr>
+        <w:pStyle w:val="ListParagraph"/>
+      </w:pPr>
+      <w:proofErr w:type="spellStart"/>
+      <w:r>
+        <w:t>list.add</w:t>
+      </w:r>
+      <w:proofErr w:type="spellEnd"/>
+      <w:r>
+        <w:t>("Java");</w:t>
+      </w:r>
+    </w:p>
+    <w:p>
+      <w:pPr>
+        <w:pStyle w:val="ListParagraph"/>
+      </w:pPr>
+    </w:p>
+    <w:p>
+      <w:pPr>
+        <w:pStyle w:val="ListParagraph"/>
+        <w:rPr>
+          <w:b/>
+          <w:bCs/>
+        </w:rPr>
+      </w:pPr>
+      <w:r>
+        <w:rPr>
+          <w:b/>
+          <w:bCs/>
+        </w:rPr>
+        <w:t xml:space="preserve">4. Does </w:t>
+      </w:r>
+      <w:proofErr w:type="spellStart"/>
+      <w:r>
+        <w:rPr>
+          <w:b/>
+          <w:bCs/>
+        </w:rPr>
+        <w:t>ArrayList</w:t>
+      </w:r>
+      <w:proofErr w:type="spellEnd"/>
+      <w:r>
+        <w:rPr>
+          <w:b/>
+          <w:bCs/>
+        </w:rPr>
+        <w:t xml:space="preserve"> maintain insertion order?</w:t>
+      </w:r>
+    </w:p>
+    <w:p>
+      <w:pPr>
+        <w:pStyle w:val="ListParagraph"/>
+      </w:pPr>
+      <w:r>
+        <w:rPr>
+          <w:b/>
+          <w:bCs/>
+        </w:rPr>
+        <w:t>Answer:</w:t>
+      </w:r>
+    </w:p>
+    <w:p>
+      <w:pPr>
+        <w:pStyle w:val="ListParagraph"/>
+      </w:pPr>
+      <w:r>
+        <w:rPr>
+          <w:rFonts w:ascii="Segoe UI Emoji" w:hAnsi="Segoe UI Emoji" w:cs="Segoe UI Emoji"/>
+        </w:rPr>
+        <w:t>✅</w:t>
+      </w:r>
+      <w:r>
+        <w:t xml:space="preserve"> Yes.</w:t>
+      </w:r>
+    </w:p>
+    <w:p>
+      <w:pPr>
+        <w:pStyle w:val="ListParagraph"/>
+      </w:pPr>
+      <w:r>
+        <w:t>Elements are returned in the same order they were inserted.</w:t>
+      </w:r>
+    </w:p>
+    <w:p>
+      <w:pPr>
+        <w:pStyle w:val="ListParagraph"/>
+      </w:pPr>
+    </w:p>
+    <w:p>
+      <w:pPr>
+        <w:pStyle w:val="ListParagraph"/>
+        <w:rPr>
+          <w:b/>
+          <w:bCs/>
+        </w:rPr>
+      </w:pPr>
+      <w:r>
+        <w:rPr>
+          <w:b/>
+          <w:bCs/>
+        </w:rPr>
+        <w:t xml:space="preserve">5. Does </w:t>
+      </w:r>
+      <w:proofErr w:type="spellStart"/>
+      <w:r>
+        <w:rPr>
+          <w:b/>
+          <w:bCs/>
+        </w:rPr>
+        <w:t>ArrayList</w:t>
+      </w:r>
+      <w:proofErr w:type="spellEnd"/>
+      <w:r>
+        <w:rPr>
+          <w:b/>
+          <w:bCs/>
+        </w:rPr>
+        <w:t xml:space="preserve"> allow null values?</w:t>
+      </w:r>
+    </w:p>
+    <w:p>
+      <w:pPr>
+        <w:pStyle w:val="ListParagraph"/>
+      </w:pPr>
+      <w:r>
+        <w:rPr>
+          <w:b/>
+          <w:bCs/>
+        </w:rPr>
+        <w:t>Answer:</w:t>
+      </w:r>
+    </w:p>
+    <w:p>
+      <w:pPr>
+        <w:pStyle w:val="ListParagraph"/>
+      </w:pPr>
+      <w:r>
+        <w:rPr>
+          <w:rFonts w:ascii="Segoe UI Emoji" w:hAnsi="Segoe UI Emoji" w:cs="Segoe UI Emoji"/>
+        </w:rPr>
+        <w:t>✅</w:t>
+      </w:r>
+      <w:r>
+        <w:t xml:space="preserve"> Yes.</w:t>
+      </w:r>
+    </w:p>
+    <w:p>
+      <w:pPr>
+        <w:pStyle w:val="ListParagraph"/>
+      </w:pPr>
+      <w:r>
+        <w:t>Example:</w:t>
+      </w:r>
+    </w:p>
+    <w:p>
+      <w:pPr>
+        <w:pStyle w:val="ListParagraph"/>
+      </w:pPr>
+      <w:proofErr w:type="spellStart"/>
+      <w:r>
+        <w:t>list.add</w:t>
+      </w:r>
+      <w:proofErr w:type="spellEnd"/>
+      <w:r>
+        <w:t>(null);</w:t>
+      </w:r>
+    </w:p>
+    <w:p>
+      <w:pPr>
+        <w:pStyle w:val="ListParagraph"/>
+      </w:pPr>
+    </w:p>
+    <w:p>
+      <w:pPr>
+        <w:pStyle w:val="ListParagraph"/>
+        <w:rPr>
+          <w:b/>
+          <w:bCs/>
+        </w:rPr>
+      </w:pPr>
+      <w:r>
+        <w:rPr>
+          <w:b/>
+          <w:bCs/>
+        </w:rPr>
+        <w:t xml:space="preserve">6. Can </w:t>
+      </w:r>
+      <w:proofErr w:type="spellStart"/>
+      <w:r>
+        <w:rPr>
+          <w:b/>
+          <w:bCs/>
+        </w:rPr>
+        <w:t>ArrayList</w:t>
+      </w:r>
+      <w:proofErr w:type="spellEnd"/>
+      <w:r>
+        <w:rPr>
+          <w:b/>
+          <w:bCs/>
+        </w:rPr>
+        <w:t xml:space="preserve"> store primitive data types?</w:t>
+      </w:r>
+    </w:p>
+    <w:p>
+      <w:pPr>
+        <w:pStyle w:val="ListParagraph"/>
+      </w:pPr>
+      <w:r>
+        <w:rPr>
+          <w:b/>
+          <w:bCs/>
+        </w:rPr>
+        <w:t>Answer:</w:t>
+      </w:r>
+    </w:p>
+    <w:p>
+      <w:pPr>
+        <w:pStyle w:val="ListParagraph"/>
+      </w:pPr>
+      <w:r>
+        <w:rPr>
+          <w:rFonts w:ascii="Segoe UI Emoji" w:hAnsi="Segoe UI Emoji" w:cs="Segoe UI Emoji"/>
+        </w:rPr>
+        <w:t>❌</w:t>
+      </w:r>
+      <w:r>
+        <w:t xml:space="preserve"> No.</w:t>
+      </w:r>
+    </w:p>
+    <w:p>
+      <w:pPr>
+        <w:pStyle w:val="ListParagraph"/>
+      </w:pPr>
+      <w:r>
+        <w:t>Wrong:</w:t>
+      </w:r>
+    </w:p>
+    <w:p>
+      <w:pPr>
+        <w:pStyle w:val="ListParagraph"/>
+      </w:pPr>
+      <w:proofErr w:type="spellStart"/>
+      <w:r>
+        <w:t>ArrayList</w:t>
+      </w:r>
+      <w:proofErr w:type="spellEnd"/>
+      <w:r>
+        <w:t>&lt;int&gt; list;</w:t>
+      </w:r>
+    </w:p>
+    <w:p>
+      <w:pPr>
+        <w:pStyle w:val="ListParagraph"/>
+      </w:pPr>
+      <w:r>
+        <w:t>Correct:</w:t>
+      </w:r>
+    </w:p>
+    <w:p>
+      <w:pPr>
+        <w:pStyle w:val="ListParagraph"/>
+      </w:pPr>
+      <w:proofErr w:type="spellStart"/>
+      <w:r>
+        <w:t>ArrayList</w:t>
+      </w:r>
+      <w:proofErr w:type="spellEnd"/>
+      <w:r>
+        <w:t>&lt;Integer&gt; list;</w:t>
+      </w:r>
+      <w:r>
+        <w:t xml:space="preserve"> </w:t>
+      </w:r>
+      <w:r>
+        <w:t xml:space="preserve">Because Collections store </w:t>
+      </w:r>
+      <w:r>
+        <w:rPr>
+          <w:b/>
+          <w:bCs/>
+        </w:rPr>
+        <w:t>objects</w:t>
+      </w:r>
+      <w:r>
+        <w:t>, not primitive types</w:t>
+      </w:r>
+      <w:r>
+        <w:t>/</w:t>
+      </w:r>
+    </w:p>
+    <w:p>
+      <w:pPr>
+        <w:pStyle w:val="ListParagraph"/>
+        <w:rPr>
+          <w:b/>
+          <w:bCs/>
+        </w:rPr>
+      </w:pPr>
+      <w:r>
+        <w:rPr>
+          <w:b/>
+          <w:bCs/>
+        </w:rPr>
+        <w:lastRenderedPageBreak/>
+        <w:t xml:space="preserve">7. Is </w:t>
+      </w:r>
+      <w:proofErr w:type="spellStart"/>
+      <w:r>
+        <w:rPr>
+          <w:b/>
+          <w:bCs/>
+        </w:rPr>
+        <w:t>ArrayList</w:t>
+      </w:r>
+      <w:proofErr w:type="spellEnd"/>
+      <w:r>
+        <w:rPr>
+          <w:b/>
+          <w:bCs/>
+        </w:rPr>
+        <w:t xml:space="preserve"> synchronized?</w:t>
+      </w:r>
+    </w:p>
+    <w:p>
+      <w:pPr>
+        <w:pStyle w:val="ListParagraph"/>
+      </w:pPr>
+      <w:r>
+        <w:rPr>
+          <w:b/>
+          <w:bCs/>
+        </w:rPr>
+        <w:t>Answer:</w:t>
+      </w:r>
+    </w:p>
+    <w:p>
+      <w:pPr>
+        <w:pStyle w:val="ListParagraph"/>
+      </w:pPr>
+      <w:r>
+        <w:rPr>
+          <w:rFonts w:ascii="Segoe UI Emoji" w:hAnsi="Segoe UI Emoji" w:cs="Segoe UI Emoji"/>
+        </w:rPr>
+        <w:t>❌</w:t>
+      </w:r>
+      <w:r>
+        <w:t xml:space="preserve"> No.</w:t>
+      </w:r>
+    </w:p>
+    <w:p>
+      <w:pPr>
+        <w:pStyle w:val="ListParagraph"/>
+      </w:pPr>
+      <w:r>
+        <w:t xml:space="preserve">It is </w:t>
+      </w:r>
+      <w:r>
+        <w:rPr>
+          <w:b/>
+          <w:bCs/>
+        </w:rPr>
+        <w:t xml:space="preserve">not </w:t>
+      </w:r>
+      <w:proofErr w:type="gramStart"/>
+      <w:r>
+        <w:rPr>
+          <w:b/>
+          <w:bCs/>
+        </w:rPr>
+        <w:t>thread-safe</w:t>
+      </w:r>
+      <w:proofErr w:type="gramEnd"/>
+      <w:r>
+        <w:t>.</w:t>
+      </w:r>
+    </w:p>
+    <w:p>
+      <w:pPr>
+        <w:pStyle w:val="ListParagraph"/>
+      </w:pPr>
+    </w:p>
+    <w:p>
+      <w:pPr>
+        <w:pStyle w:val="ListParagraph"/>
+        <w:rPr>
+          <w:b/>
+          <w:bCs/>
+        </w:rPr>
+      </w:pPr>
+      <w:r>
+        <w:rPr>
+          <w:b/>
+          <w:bCs/>
+        </w:rPr>
+        <w:t xml:space="preserve">8. Difference between Array and </w:t>
+      </w:r>
+      <w:proofErr w:type="spellStart"/>
+      <w:r>
+        <w:rPr>
+          <w:b/>
+          <w:bCs/>
+        </w:rPr>
+        <w:t>ArrayList</w:t>
+      </w:r>
+      <w:proofErr w:type="spellEnd"/>
+      <w:r>
+        <w:rPr>
+          <w:b/>
+          <w:bCs/>
+        </w:rPr>
+        <w:t>?</w:t>
+      </w:r>
+    </w:p>
+    <w:tbl>
+      <w:tblPr>
+        <w:tblW w:w="0" w:type="auto"/>
+        <w:tblCellSpacing w:w="15" w:type="dxa"/>
+        <w:tblCellMar>
+          <w:top w:w="15" w:type="dxa"/>
+          <w:left w:w="15" w:type="dxa"/>
+          <w:bottom w:w="15" w:type="dxa"/>
+          <w:right w:w="15" w:type="dxa"/>
+        </w:tblCellMar>
+        <w:tblLook w:val="04A0" w:firstRow="1" w:lastRow="0" w:firstColumn="1" w:lastColumn="0" w:noHBand="0" w:noVBand="1"/>
+      </w:tblPr>
+      <w:tblGrid>
+        <w:gridCol w:w="3546"/>
+        <w:gridCol w:w="3107"/>
+      </w:tblGrid>
+      <w:tr>
+        <w:trPr>
+          <w:tblHeader/>
+          <w:tblCellSpacing w:w="15" w:type="dxa"/>
+        </w:trPr>
+        <w:tc>
+          <w:tcPr>
+            <w:tcW w:w="0" w:type="auto"/>
+            <w:vAlign w:val="center"/>
+            <w:hideMark/>
+          </w:tcPr>
+          <w:p>
+            <w:pPr>
+              <w:pStyle w:val="ListParagraph"/>
+              <w:rPr>
+                <w:b/>
+                <w:bCs/>
+              </w:rPr>
+            </w:pPr>
+            <w:r>
+              <w:rPr>
+                <w:b/>
+                <w:bCs/>
+              </w:rPr>
+              <w:t>Array</w:t>
+            </w:r>
+          </w:p>
+        </w:tc>
+        <w:tc>
+          <w:tcPr>
+            <w:tcW w:w="0" w:type="auto"/>
+            <w:vAlign w:val="center"/>
+            <w:hideMark/>
+          </w:tcPr>
+          <w:p>
+            <w:pPr>
+              <w:pStyle w:val="ListParagraph"/>
+              <w:rPr>
+                <w:b/>
+                <w:bCs/>
+              </w:rPr>
+            </w:pPr>
+            <w:proofErr w:type="spellStart"/>
+            <w:r>
+              <w:rPr>
+                <w:b/>
+                <w:bCs/>
+              </w:rPr>
+              <w:t>ArrayList</w:t>
+            </w:r>
+            <w:proofErr w:type="spellEnd"/>
+          </w:p>
+        </w:tc>
+      </w:tr>
+      <w:tr>
+        <w:trPr>
+          <w:tblCellSpacing w:w="15" w:type="dxa"/>
+        </w:trPr>
+        <w:tc>
+          <w:tcPr>
+            <w:tcW w:w="0" w:type="auto"/>
+            <w:vAlign w:val="center"/>
+            <w:hideMark/>
+          </w:tcPr>
+          <w:p>
+            <w:pPr>
+              <w:pStyle w:val="ListParagraph"/>
+            </w:pPr>
+            <w:r>
+              <w:t>Fixed size</w:t>
+            </w:r>
+          </w:p>
+        </w:tc>
+        <w:tc>
+          <w:tcPr>
+            <w:tcW w:w="0" w:type="auto"/>
+            <w:vAlign w:val="center"/>
+            <w:hideMark/>
+          </w:tcPr>
+          <w:p>
+            <w:pPr>
+              <w:pStyle w:val="ListParagraph"/>
+            </w:pPr>
+            <w:r>
+              <w:t>Dynamic size</w:t>
+            </w:r>
+          </w:p>
+        </w:tc>
+      </w:tr>
+      <w:tr>
+        <w:trPr>
+          <w:tblCellSpacing w:w="15" w:type="dxa"/>
+        </w:trPr>
+        <w:tc>
+          <w:tcPr>
+            <w:tcW w:w="0" w:type="auto"/>
+            <w:vAlign w:val="center"/>
+            <w:hideMark/>
+          </w:tcPr>
+          <w:p>
+            <w:pPr>
+              <w:pStyle w:val="ListParagraph"/>
+            </w:pPr>
+            <w:r>
+              <w:t>Stores primitives &amp; objects</w:t>
+            </w:r>
+          </w:p>
+        </w:tc>
+        <w:tc>
+          <w:tcPr>
+            <w:tcW w:w="0" w:type="auto"/>
+            <w:vAlign w:val="center"/>
+            <w:hideMark/>
+          </w:tcPr>
+          <w:p>
+            <w:pPr>
+              <w:pStyle w:val="ListParagraph"/>
+            </w:pPr>
+            <w:r>
+              <w:t>Stores only objects</w:t>
+            </w:r>
+          </w:p>
+        </w:tc>
+      </w:tr>
+      <w:tr>
+        <w:trPr>
+          <w:tblCellSpacing w:w="15" w:type="dxa"/>
+        </w:trPr>
+        <w:tc>
+          <w:tcPr>
+            <w:tcW w:w="0" w:type="auto"/>
+            <w:vAlign w:val="center"/>
+            <w:hideMark/>
+          </w:tcPr>
+          <w:p>
+            <w:pPr>
+              <w:pStyle w:val="ListParagraph"/>
+            </w:pPr>
+            <w:r>
+              <w:t>Less flexible</w:t>
+            </w:r>
+          </w:p>
+        </w:tc>
+        <w:tc>
+          <w:tcPr>
+            <w:tcW w:w="0" w:type="auto"/>
+            <w:vAlign w:val="center"/>
+            <w:hideMark/>
+          </w:tcPr>
+          <w:p>
+            <w:pPr>
+              <w:pStyle w:val="ListParagraph"/>
+            </w:pPr>
+            <w:r>
+              <w:t>More flexible</w:t>
+            </w:r>
+          </w:p>
+        </w:tc>
+      </w:tr>
+      <w:tr>
+        <w:trPr>
+          <w:tblCellSpacing w:w="15" w:type="dxa"/>
+        </w:trPr>
+        <w:tc>
+          <w:tcPr>
+            <w:tcW w:w="0" w:type="auto"/>
+            <w:vAlign w:val="center"/>
+            <w:hideMark/>
+          </w:tcPr>
+          <w:p>
+            <w:pPr>
+              <w:pStyle w:val="ListParagraph"/>
+            </w:pPr>
+            <w:r>
+              <w:t>No built-in methods</w:t>
+            </w:r>
+          </w:p>
+        </w:tc>
+        <w:tc>
+          <w:tcPr>
+            <w:tcW w:w="0" w:type="auto"/>
+            <w:vAlign w:val="center"/>
+            <w:hideMark/>
+          </w:tcPr>
+          <w:p>
+            <w:pPr>
+              <w:pStyle w:val="ListParagraph"/>
+            </w:pPr>
+            <w:r>
+              <w:t>Many built-in methods</w:t>
+            </w:r>
+          </w:p>
+        </w:tc>
+      </w:tr>
+    </w:tbl>
+    <w:p>
+      <w:pPr>
+        <w:pStyle w:val="ListParagraph"/>
+        <w:rPr>
+          <w:b/>
+          <w:bCs/>
+        </w:rPr>
+      </w:pPr>
+      <w:r>
+        <w:rPr>
+          <w:b/>
+          <w:bCs/>
+        </w:rPr>
+        <w:t xml:space="preserve">9. Difference between </w:t>
+      </w:r>
+      <w:proofErr w:type="spellStart"/>
+      <w:r>
+        <w:rPr>
+          <w:b/>
+          <w:bCs/>
+        </w:rPr>
+        <w:t>ArrayList</w:t>
+      </w:r>
+      <w:proofErr w:type="spellEnd"/>
+      <w:r>
+        <w:rPr>
+          <w:b/>
+          <w:bCs/>
+        </w:rPr>
+        <w:t xml:space="preserve"> and LinkedList?</w:t>
+      </w:r>
+    </w:p>
+    <w:tbl>
+      <w:tblPr>
+        <w:tblW w:w="0" w:type="auto"/>
+        <w:tblCellSpacing w:w="15" w:type="dxa"/>
+        <w:tblCellMar>
+          <w:top w:w="15" w:type="dxa"/>
+          <w:left w:w="15" w:type="dxa"/>
+          <w:bottom w:w="15" w:type="dxa"/>
+          <w:right w:w="15" w:type="dxa"/>
+        </w:tblCellMar>
+        <w:tblLook w:val="04A0" w:firstRow="1" w:lastRow="0" w:firstColumn="1" w:lastColumn="0" w:noHBand="0" w:noVBand="1"/>
+      </w:tblPr>
+      <w:tblGrid>
+        <w:gridCol w:w="4047"/>
+        <w:gridCol w:w="3989"/>
+      </w:tblGrid>
+      <w:tr>
+        <w:trPr>
+          <w:tblHeader/>
+          <w:tblCellSpacing w:w="15" w:type="dxa"/>
+        </w:trPr>
+        <w:tc>
+          <w:tcPr>
+            <w:tcW w:w="0" w:type="auto"/>
+            <w:vAlign w:val="center"/>
+            <w:hideMark/>
+          </w:tcPr>
+          <w:p>
+            <w:pPr>
+              <w:pStyle w:val="ListParagraph"/>
+              <w:rPr>
+                <w:b/>
+                <w:bCs/>
+              </w:rPr>
+            </w:pPr>
+            <w:proofErr w:type="spellStart"/>
+            <w:r>
+              <w:rPr>
+                <w:b/>
+                <w:bCs/>
+              </w:rPr>
+              <w:t>ArrayList</w:t>
+            </w:r>
+            <w:proofErr w:type="spellEnd"/>
+          </w:p>
+        </w:tc>
+        <w:tc>
+          <w:tcPr>
+            <w:tcW w:w="0" w:type="auto"/>
+            <w:vAlign w:val="center"/>
+            <w:hideMark/>
+          </w:tcPr>
+          <w:p>
+            <w:pPr>
+              <w:pStyle w:val="ListParagraph"/>
+              <w:rPr>
+                <w:b/>
+                <w:bCs/>
+              </w:rPr>
+            </w:pPr>
+            <w:r>
+              <w:rPr>
+                <w:b/>
+                <w:bCs/>
+              </w:rPr>
+              <w:t>LinkedList</w:t>
+            </w:r>
+          </w:p>
+        </w:tc>
+      </w:tr>
+      <w:tr>
+        <w:trPr>
+          <w:tblCellSpacing w:w="15" w:type="dxa"/>
+        </w:trPr>
+        <w:tc>
+          <w:tcPr>
+            <w:tcW w:w="0" w:type="auto"/>
+            <w:vAlign w:val="center"/>
+            <w:hideMark/>
+          </w:tcPr>
+          <w:p>
+            <w:pPr>
+              <w:pStyle w:val="ListParagraph"/>
+            </w:pPr>
+            <w:r>
+              <w:t>Uses a dynamic array</w:t>
+            </w:r>
+          </w:p>
+        </w:tc>
+        <w:tc>
+          <w:tcPr>
+            <w:tcW w:w="0" w:type="auto"/>
+            <w:vAlign w:val="center"/>
+            <w:hideMark/>
+          </w:tcPr>
+          <w:p>
+            <w:pPr>
+              <w:pStyle w:val="ListParagraph"/>
+            </w:pPr>
+            <w:r>
+              <w:t>Uses a doubly linked list</w:t>
+            </w:r>
+          </w:p>
+        </w:tc>
+      </w:tr>
+      <w:tr>
+        <w:trPr>
+          <w:tblCellSpacing w:w="15" w:type="dxa"/>
+        </w:trPr>
+        <w:tc>
+          <w:tcPr>
+            <w:tcW w:w="0" w:type="auto"/>
+            <w:vAlign w:val="center"/>
+            <w:hideMark/>
+          </w:tcPr>
+          <w:p>
+            <w:pPr>
+              <w:pStyle w:val="ListParagraph"/>
+            </w:pPr>
+            <w:r>
+              <w:t>Fast random access (get)</w:t>
+            </w:r>
+          </w:p>
+        </w:tc>
+        <w:tc>
+          <w:tcPr>
+            <w:tcW w:w="0" w:type="auto"/>
+            <w:vAlign w:val="center"/>
+            <w:hideMark/>
+          </w:tcPr>
+          <w:p>
+            <w:pPr>
+              <w:pStyle w:val="ListParagraph"/>
+            </w:pPr>
+            <w:r>
+              <w:t>Slower random access</w:t>
+            </w:r>
+          </w:p>
+        </w:tc>
+      </w:tr>
+      <w:tr>
+        <w:trPr>
+          <w:tblCellSpacing w:w="15" w:type="dxa"/>
+        </w:trPr>
+        <w:tc>
+          <w:tcPr>
+            <w:tcW w:w="0" w:type="auto"/>
+            <w:vAlign w:val="center"/>
+            <w:hideMark/>
+          </w:tcPr>
+          <w:p>
+            <w:pPr>
+              <w:pStyle w:val="ListParagraph"/>
+            </w:pPr>
+            <w:r>
+              <w:t>Slow insert/delete in the middle</w:t>
+            </w:r>
+          </w:p>
+        </w:tc>
+        <w:tc>
+          <w:tcPr>
+            <w:tcW w:w="0" w:type="auto"/>
+            <w:vAlign w:val="center"/>
+            <w:hideMark/>
+          </w:tcPr>
+          <w:p>
+            <w:pPr>
+              <w:pStyle w:val="ListParagraph"/>
+            </w:pPr>
+            <w:r>
+              <w:t>Fast insert/delete in the middle</w:t>
+            </w:r>
+          </w:p>
+        </w:tc>
+      </w:tr>
+    </w:tbl>
+    <w:p>
+      <w:pPr>
+        <w:pStyle w:val="ListParagraph"/>
+      </w:pPr>
+      <w:r>
+        <w:pict w14:anchorId="6420047F">
+          <v:rect id="_x0000_i1361" style="width:0;height:1.5pt" o:hralign="center" o:hrstd="t" o:hr="t" fillcolor="#a0a0a0" stroked="f"/>
+        </w:pict>
+      </w:r>
+    </w:p>
+    <w:p>
+      <w:pPr>
+        <w:pStyle w:val="ListParagraph"/>
+        <w:rPr>
+          <w:b/>
+          <w:bCs/>
+        </w:rPr>
+      </w:pPr>
+      <w:r>
+        <w:rPr>
+          <w:b/>
+          <w:bCs/>
+        </w:rPr>
+        <w:t xml:space="preserve">10. Which package contains </w:t>
+      </w:r>
+      <w:proofErr w:type="spellStart"/>
+      <w:r>
+        <w:rPr>
+          <w:b/>
+          <w:bCs/>
+        </w:rPr>
+        <w:t>ArrayList</w:t>
+      </w:r>
+      <w:proofErr w:type="spellEnd"/>
+      <w:r>
+        <w:rPr>
+          <w:b/>
+          <w:bCs/>
+        </w:rPr>
+        <w:t>?</w:t>
+      </w:r>
+    </w:p>
+    <w:p>
+      <w:pPr>
+        <w:pStyle w:val="ListParagraph"/>
+      </w:pPr>
+      <w:r>
+        <w:rPr>
+          <w:b/>
+          <w:bCs/>
+        </w:rPr>
+        <w:t>Answer:</w:t>
+      </w:r>
+    </w:p>
+    <w:p>
+      <w:pPr>
+        <w:pStyle w:val="ListParagraph"/>
+      </w:pPr>
+      <w:proofErr w:type="spellStart"/>
+      <w:proofErr w:type="gramStart"/>
+      <w:r>
+        <w:t>java.util</w:t>
+      </w:r>
+      <w:proofErr w:type="spellEnd"/>
+      <w:proofErr w:type="gramEnd"/>
+    </w:p>
+    <w:p>
+      <w:pPr>
+        <w:pStyle w:val="ListParagraph"/>
+      </w:pPr>
+      <w:r>
+        <w:pict w14:anchorId="3B596350">
+          <v:rect id="_x0000_i1362" style="width:0;height:1.5pt" o:hralign="center" o:hrstd="t" o:hr="t" fillcolor="#a0a0a0" stroked="f"/>
+        </w:pict>
+      </w:r>
+    </w:p>
+    <w:p>
+      <w:pPr>
+        <w:pStyle w:val="ListParagraph"/>
+        <w:rPr>
+          <w:b/>
+          <w:bCs/>
+        </w:rPr>
+      </w:pPr>
+      <w:r>
+        <w:rPr>
+          <w:b/>
+          <w:bCs/>
+        </w:rPr>
+        <w:t xml:space="preserve">11. How do you create an </w:t>
+      </w:r>
+      <w:proofErr w:type="spellStart"/>
+      <w:r>
+        <w:rPr>
+          <w:b/>
+          <w:bCs/>
+        </w:rPr>
+        <w:t>ArrayList</w:t>
+      </w:r>
+      <w:proofErr w:type="spellEnd"/>
+      <w:r>
+        <w:rPr>
+          <w:b/>
+          <w:bCs/>
+        </w:rPr>
+        <w:t>?</w:t>
+      </w:r>
+    </w:p>
+    <w:p>
+      <w:pPr>
+        <w:pStyle w:val="ListParagraph"/>
+      </w:pPr>
+      <w:proofErr w:type="spellStart"/>
+      <w:r>
+        <w:t>ArrayList</w:t>
+      </w:r>
+      <w:proofErr w:type="spellEnd"/>
+      <w:r>
+        <w:t xml:space="preserve">&lt;String&gt; list = new </w:t>
+      </w:r>
+      <w:proofErr w:type="spellStart"/>
+      <w:r>
+        <w:t>ArrayList</w:t>
+      </w:r>
+      <w:proofErr w:type="spellEnd"/>
+      <w:r>
+        <w:t>&lt;</w:t>
+      </w:r>
+      <w:proofErr w:type="gramStart"/>
+      <w:r>
+        <w:t>&gt;(</w:t>
+      </w:r>
+      <w:proofErr w:type="gramEnd"/>
+      <w:r>
+        <w:t>);</w:t>
+      </w:r>
+    </w:p>
+    <w:p>
+      <w:pPr>
+        <w:pStyle w:val="ListParagraph"/>
+      </w:pPr>
+      <w:r>
+        <w:t>or</w:t>
+      </w:r>
+    </w:p>
+    <w:p>
+      <w:pPr>
+        <w:pStyle w:val="ListParagraph"/>
+      </w:pPr>
+      <w:r>
+        <w:t xml:space="preserve">List&lt;String&gt; list = new </w:t>
+      </w:r>
+      <w:proofErr w:type="spellStart"/>
+      <w:r>
+        <w:t>ArrayList</w:t>
+      </w:r>
+      <w:proofErr w:type="spellEnd"/>
+      <w:r>
+        <w:t>&lt;</w:t>
+      </w:r>
+      <w:proofErr w:type="gramStart"/>
+      <w:r>
+        <w:t>&gt;(</w:t>
+      </w:r>
+      <w:proofErr w:type="gramEnd"/>
+      <w:r>
+        <w:t>);</w:t>
+      </w:r>
+    </w:p>
+    <w:p>
+      <w:pPr>
+        <w:pStyle w:val="ListParagraph"/>
+      </w:pPr>
+      <w:r>
+        <w:pict w14:anchorId="6F43D278">
+          <v:rect id="_x0000_i1363" style="width:0;height:1.5pt" o:hralign="center" o:hrstd="t" o:hr="t" fillcolor="#a0a0a0" stroked="f"/>
+        </w:pict>
+      </w:r>
+    </w:p>
+    <w:p>
+      <w:pPr>
+        <w:pStyle w:val="ListParagraph"/>
+        <w:rPr>
+          <w:b/>
+          <w:bCs/>
+        </w:rPr>
+      </w:pPr>
+      <w:r>
+        <w:rPr>
+          <w:b/>
+          <w:bCs/>
+        </w:rPr>
+        <w:t>12. Which declaration is recommended?</w:t>
+      </w:r>
+    </w:p>
+    <w:p>
+      <w:pPr>
+        <w:pStyle w:val="ListParagraph"/>
+      </w:pPr>
+      <w:proofErr w:type="spellStart"/>
+      <w:r>
+        <w:t>ArrayList</w:t>
+      </w:r>
+      <w:proofErr w:type="spellEnd"/>
+      <w:r>
+        <w:t xml:space="preserve">&lt;String&gt; list = new </w:t>
+      </w:r>
+      <w:proofErr w:type="spellStart"/>
+      <w:r>
+        <w:t>ArrayList</w:t>
+      </w:r>
+      <w:proofErr w:type="spellEnd"/>
+      <w:r>
+        <w:t>&lt;</w:t>
+      </w:r>
+      <w:proofErr w:type="gramStart"/>
+      <w:r>
+        <w:t>&gt;(</w:t>
+      </w:r>
+      <w:proofErr w:type="gramEnd"/>
+      <w:r>
+        <w:t>);</w:t>
+      </w:r>
+    </w:p>
+    <w:p>
+      <w:pPr>
+        <w:pStyle w:val="ListParagraph"/>
+      </w:pPr>
+      <w:r>
+        <w:t>or</w:t>
+      </w:r>
+    </w:p>
+    <w:p>
+      <w:pPr>
+        <w:pStyle w:val="ListParagraph"/>
+      </w:pPr>
+      <w:r>
+        <w:t xml:space="preserve">List&lt;String&gt; list = new </w:t>
+      </w:r>
+      <w:proofErr w:type="spellStart"/>
+      <w:r>
+        <w:t>ArrayList</w:t>
+      </w:r>
+      <w:proofErr w:type="spellEnd"/>
+      <w:r>
+        <w:t>&lt;</w:t>
+      </w:r>
+      <w:proofErr w:type="gramStart"/>
+      <w:r>
+        <w:t>&gt;(</w:t>
+      </w:r>
+      <w:proofErr w:type="gramEnd"/>
+      <w:r>
+        <w:t>);</w:t>
+      </w:r>
+    </w:p>
+    <w:p>
+      <w:pPr>
+        <w:pStyle w:val="ListParagraph"/>
+      </w:pPr>
+      <w:r>
+        <w:rPr>
+          <w:b/>
+          <w:bCs/>
+        </w:rPr>
+        <w:t>Answer:</w:t>
+      </w:r>
+    </w:p>
+    <w:p>
+      <w:pPr>
+        <w:pStyle w:val="ListParagraph"/>
+      </w:pPr>
+      <w:r>
+        <w:t xml:space="preserve">List&lt;String&gt; list = new </w:t>
+      </w:r>
+      <w:proofErr w:type="spellStart"/>
+      <w:r>
+        <w:t>ArrayList</w:t>
+      </w:r>
+      <w:proofErr w:type="spellEnd"/>
+      <w:r>
+        <w:t>&lt;</w:t>
+      </w:r>
+      <w:proofErr w:type="gramStart"/>
+      <w:r>
+        <w:t>&gt;(</w:t>
+      </w:r>
+      <w:proofErr w:type="gramEnd"/>
+      <w:r>
+        <w:t>);</w:t>
+      </w:r>
+    </w:p>
+    <w:p>
+      <w:pPr>
+        <w:pStyle w:val="ListParagraph"/>
+      </w:pPr>
+      <w:r>
+        <w:t xml:space="preserve">Because we should </w:t>
+      </w:r>
+      <w:r>
+        <w:rPr>
+          <w:b/>
+          <w:bCs/>
+        </w:rPr>
+        <w:t>program to the interface</w:t>
+      </w:r>
+      <w:r>
+        <w:t>, not the implementation.</w:t>
+      </w:r>
+    </w:p>
+    <w:p>
+      <w:pPr>
+        <w:pStyle w:val="ListParagraph"/>
+      </w:pPr>
+      <w:r>
+        <w:pict w14:anchorId="17EE40B4">
+          <v:rect id="_x0000_i1364" style="width:0;height:1.5pt" o:hralign="center" o:hrstd="t" o:hr="t" fillcolor="#a0a0a0" stroked="f"/>
+        </w:pict>
+      </w:r>
+    </w:p>
+    <w:p>
+      <w:pPr>
+        <w:pStyle w:val="ListParagraph"/>
+        <w:rPr>
+          <w:b/>
+          <w:bCs/>
+        </w:rPr>
+      </w:pPr>
+      <w:r>
+        <w:rPr>
+          <w:b/>
+          <w:bCs/>
+        </w:rPr>
+        <w:t>13. What are the commonly used methods?</w:t>
+      </w:r>
+    </w:p>
+    <w:p>
+      <w:pPr>
+        <w:pStyle w:val="ListParagraph"/>
+        <w:numPr>
+          <w:ilvl w:val="0"/>
+          <w:numId w:val="3"/>
+        </w:numPr>
+      </w:pPr>
+      <w:proofErr w:type="gramStart"/>
+      <w:r>
+        <w:lastRenderedPageBreak/>
+        <w:t>add(</w:t>
+      </w:r>
+      <w:proofErr w:type="gramEnd"/>
+      <w:r>
+        <w:t xml:space="preserve">) </w:t>
+      </w:r>
+    </w:p>
+    <w:p>
+      <w:pPr>
+        <w:pStyle w:val="ListParagraph"/>
+        <w:numPr>
+          <w:ilvl w:val="0"/>
+          <w:numId w:val="3"/>
+        </w:numPr>
+      </w:pPr>
+      <w:proofErr w:type="gramStart"/>
+      <w:r>
+        <w:t>get(</w:t>
+      </w:r>
+      <w:proofErr w:type="gramEnd"/>
+      <w:r>
+        <w:t xml:space="preserve">) </w:t>
+      </w:r>
+    </w:p>
+    <w:p>
+      <w:pPr>
+        <w:pStyle w:val="ListParagraph"/>
+        <w:numPr>
+          <w:ilvl w:val="0"/>
+          <w:numId w:val="3"/>
+        </w:numPr>
+      </w:pPr>
+      <w:proofErr w:type="gramStart"/>
+      <w:r>
+        <w:t>set(</w:t>
+      </w:r>
+      <w:proofErr w:type="gramEnd"/>
+      <w:r>
+        <w:t xml:space="preserve">) </w:t>
+      </w:r>
+    </w:p>
+    <w:p>
+      <w:pPr>
+        <w:pStyle w:val="ListParagraph"/>
+        <w:numPr>
+          <w:ilvl w:val="0"/>
+          <w:numId w:val="3"/>
+        </w:numPr>
+      </w:pPr>
+      <w:proofErr w:type="gramStart"/>
+      <w:r>
+        <w:t>remove(</w:t>
+      </w:r>
+      <w:proofErr w:type="gramEnd"/>
+      <w:r>
+        <w:t xml:space="preserve">) </w:t>
+      </w:r>
+    </w:p>
+    <w:p>
+      <w:pPr>
+        <w:pStyle w:val="ListParagraph"/>
+        <w:numPr>
+          <w:ilvl w:val="0"/>
+          <w:numId w:val="3"/>
+        </w:numPr>
+      </w:pPr>
+      <w:proofErr w:type="gramStart"/>
+      <w:r>
+        <w:t>size(</w:t>
+      </w:r>
+      <w:proofErr w:type="gramEnd"/>
+      <w:r>
+        <w:t xml:space="preserve">) </w:t>
+      </w:r>
+    </w:p>
+    <w:p>
+      <w:pPr>
+        <w:pStyle w:val="ListParagraph"/>
+        <w:numPr>
+          <w:ilvl w:val="0"/>
+          <w:numId w:val="3"/>
+        </w:numPr>
+      </w:pPr>
+      <w:proofErr w:type="gramStart"/>
+      <w:r>
+        <w:t>contains(</w:t>
+      </w:r>
+      <w:proofErr w:type="gramEnd"/>
+      <w:r>
+        <w:t xml:space="preserve">) </w:t>
+      </w:r>
+    </w:p>
+    <w:p>
+      <w:pPr>
+        <w:pStyle w:val="ListParagraph"/>
+        <w:numPr>
+          <w:ilvl w:val="0"/>
+          <w:numId w:val="3"/>
+        </w:numPr>
+      </w:pPr>
+      <w:proofErr w:type="gramStart"/>
+      <w:r>
+        <w:t>clear(</w:t>
+      </w:r>
+      <w:proofErr w:type="gramEnd"/>
+      <w:r>
+        <w:t xml:space="preserve">) </w:t>
+      </w:r>
+    </w:p>
+    <w:p>
+      <w:pPr>
+        <w:pStyle w:val="ListParagraph"/>
+        <w:numPr>
+          <w:ilvl w:val="0"/>
+          <w:numId w:val="3"/>
+        </w:numPr>
+      </w:pPr>
+      <w:proofErr w:type="spellStart"/>
+      <w:proofErr w:type="gramStart"/>
+      <w:r>
+        <w:t>isEmpty</w:t>
+      </w:r>
+      <w:proofErr w:type="spellEnd"/>
+      <w:r>
+        <w:t>(</w:t>
+      </w:r>
+      <w:proofErr w:type="gramEnd"/>
+      <w:r>
+        <w:t xml:space="preserve">) </w:t>
+      </w:r>
+    </w:p>
+    <w:p>
+      <w:pPr>
+        <w:pStyle w:val="ListParagraph"/>
+      </w:pPr>
+      <w:r>
+        <w:pict w14:anchorId="2A34FDA7">
+          <v:rect id="_x0000_i1365" style="width:0;height:1.5pt" o:hralign="center" o:hrstd="t" o:hr="t" fillcolor="#a0a0a0" stroked="f"/>
+        </w:pict>
+      </w:r>
+    </w:p>
+    <w:p>
+      <w:pPr>
+        <w:pStyle w:val="ListParagraph"/>
+        <w:rPr>
+          <w:b/>
+          <w:bCs/>
+        </w:rPr>
+      </w:pPr>
+      <w:r>
+        <w:rPr>
+          <w:b/>
+          <w:bCs/>
+        </w:rPr>
+        <w:t>14. What is the time complexity?</w:t>
+      </w:r>
+    </w:p>
+    <w:tbl>
+      <w:tblPr>
+        <w:tblW w:w="0" w:type="auto"/>
+        <w:tblCellSpacing w:w="15" w:type="dxa"/>
+        <w:tblCellMar>
+          <w:top w:w="15" w:type="dxa"/>
+          <w:left w:w="15" w:type="dxa"/>
+          <w:bottom w:w="15" w:type="dxa"/>
+          <w:right w:w="15" w:type="dxa"/>
+        </w:tblCellMar>
+        <w:tblLook w:val="04A0" w:firstRow="1" w:lastRow="0" w:firstColumn="1" w:lastColumn="0" w:noHBand="0" w:noVBand="1"/>
+      </w:tblPr>
+      <w:tblGrid>
+        <w:gridCol w:w="2616"/>
+        <w:gridCol w:w="2471"/>
+      </w:tblGrid>
+      <w:tr>
+        <w:trPr>
+          <w:tblHeader/>
+          <w:tblCellSpacing w:w="15" w:type="dxa"/>
+        </w:trPr>
+        <w:tc>
+          <w:tcPr>
+            <w:tcW w:w="0" w:type="auto"/>
+            <w:vAlign w:val="center"/>
+            <w:hideMark/>
+          </w:tcPr>
+          <w:p>
+            <w:pPr>
+              <w:pStyle w:val="ListParagraph"/>
+              <w:rPr>
+                <w:b/>
+                <w:bCs/>
+              </w:rPr>
+            </w:pPr>
+            <w:r>
+              <w:rPr>
+                <w:b/>
+                <w:bCs/>
+              </w:rPr>
+              <w:t>Operation</w:t>
+            </w:r>
+          </w:p>
+        </w:tc>
+        <w:tc>
+          <w:tcPr>
+            <w:tcW w:w="0" w:type="auto"/>
+            <w:vAlign w:val="center"/>
+            <w:hideMark/>
+          </w:tcPr>
+          <w:p>
+            <w:pPr>
+              <w:pStyle w:val="ListParagraph"/>
+              <w:rPr>
+                <w:b/>
+                <w:bCs/>
+              </w:rPr>
+            </w:pPr>
+            <w:r>
+              <w:rPr>
+                <w:b/>
+                <w:bCs/>
+              </w:rPr>
+              <w:t>Complexity</w:t>
+            </w:r>
+          </w:p>
+        </w:tc>
+      </w:tr>
+      <w:tr>
+        <w:trPr>
+          <w:tblCellSpacing w:w="15" w:type="dxa"/>
+        </w:trPr>
+        <w:tc>
+          <w:tcPr>
+            <w:tcW w:w="0" w:type="auto"/>
+            <w:vAlign w:val="center"/>
+            <w:hideMark/>
+          </w:tcPr>
+          <w:p>
+            <w:pPr>
+              <w:pStyle w:val="ListParagraph"/>
+            </w:pPr>
+            <w:proofErr w:type="gramStart"/>
+            <w:r>
+              <w:t>get(</w:t>
+            </w:r>
+            <w:proofErr w:type="gramEnd"/>
+            <w:r>
+              <w:t>)</w:t>
+            </w:r>
+          </w:p>
+        </w:tc>
+        <w:tc>
+          <w:tcPr>
+            <w:tcW w:w="0" w:type="auto"/>
+            <w:vAlign w:val="center"/>
+            <w:hideMark/>
+          </w:tcPr>
+          <w:p>
+            <w:pPr>
+              <w:pStyle w:val="ListParagraph"/>
+            </w:pPr>
+            <w:proofErr w:type="gramStart"/>
+            <w:r>
+              <w:t>O(</w:t>
+            </w:r>
+            <w:proofErr w:type="gramEnd"/>
+            <w:r>
+              <w:t>1)</w:t>
+            </w:r>
+          </w:p>
+        </w:tc>
+      </w:tr>
+      <w:tr>
+        <w:trPr>
+          <w:tblCellSpacing w:w="15" w:type="dxa"/>
+        </w:trPr>
+        <w:tc>
+          <w:tcPr>
+            <w:tcW w:w="0" w:type="auto"/>
+            <w:vAlign w:val="center"/>
+            <w:hideMark/>
+          </w:tcPr>
+          <w:p>
+            <w:pPr>
+              <w:pStyle w:val="ListParagraph"/>
+            </w:pPr>
+            <w:proofErr w:type="gramStart"/>
+            <w:r>
+              <w:t>set(</w:t>
+            </w:r>
+            <w:proofErr w:type="gramEnd"/>
+            <w:r>
+              <w:t>)</w:t>
+            </w:r>
+          </w:p>
+        </w:tc>
+        <w:tc>
+          <w:tcPr>
+            <w:tcW w:w="0" w:type="auto"/>
+            <w:vAlign w:val="center"/>
+            <w:hideMark/>
+          </w:tcPr>
+          <w:p>
+            <w:pPr>
+              <w:pStyle w:val="ListParagraph"/>
+            </w:pPr>
+            <w:proofErr w:type="gramStart"/>
+            <w:r>
+              <w:t>O(</w:t>
+            </w:r>
+            <w:proofErr w:type="gramEnd"/>
+            <w:r>
+              <w:t>1)</w:t>
+            </w:r>
+          </w:p>
+        </w:tc>
+      </w:tr>
+      <w:tr>
+        <w:trPr>
+          <w:tblCellSpacing w:w="15" w:type="dxa"/>
+        </w:trPr>
+        <w:tc>
+          <w:tcPr>
+            <w:tcW w:w="0" w:type="auto"/>
+            <w:vAlign w:val="center"/>
+            <w:hideMark/>
+          </w:tcPr>
+          <w:p>
+            <w:pPr>
+              <w:pStyle w:val="ListParagraph"/>
+            </w:pPr>
+            <w:proofErr w:type="gramStart"/>
+            <w:r>
+              <w:t>add(</w:t>
+            </w:r>
+            <w:proofErr w:type="gramEnd"/>
+            <w:r>
+              <w:t>) (end)</w:t>
+            </w:r>
+          </w:p>
+        </w:tc>
+        <w:tc>
+          <w:tcPr>
+            <w:tcW w:w="0" w:type="auto"/>
+            <w:vAlign w:val="center"/>
+            <w:hideMark/>
+          </w:tcPr>
+          <w:p>
+            <w:pPr>
+              <w:pStyle w:val="ListParagraph"/>
+            </w:pPr>
+            <w:proofErr w:type="gramStart"/>
+            <w:r>
+              <w:t>O(</w:t>
+            </w:r>
+            <w:proofErr w:type="gramEnd"/>
+            <w:r>
+              <w:t>1) (amortized)</w:t>
+            </w:r>
+          </w:p>
+        </w:tc>
+      </w:tr>
+      <w:tr>
+        <w:trPr>
+          <w:tblCellSpacing w:w="15" w:type="dxa"/>
+        </w:trPr>
+        <w:tc>
+          <w:tcPr>
+            <w:tcW w:w="0" w:type="auto"/>
+            <w:vAlign w:val="center"/>
+            <w:hideMark/>
+          </w:tcPr>
+          <w:p>
+            <w:pPr>
+              <w:pStyle w:val="ListParagraph"/>
+            </w:pPr>
+            <w:proofErr w:type="gramStart"/>
+            <w:r>
+              <w:t>remove(</w:t>
+            </w:r>
+            <w:proofErr w:type="gramEnd"/>
+            <w:r>
+              <w:t>) (middle)</w:t>
+            </w:r>
+          </w:p>
+        </w:tc>
+        <w:tc>
+          <w:tcPr>
+            <w:tcW w:w="0" w:type="auto"/>
+            <w:vAlign w:val="center"/>
+            <w:hideMark/>
+          </w:tcPr>
+          <w:p>
+            <w:pPr>
+              <w:pStyle w:val="ListParagraph"/>
+            </w:pPr>
+            <w:r>
+              <w:t>O(n)</w:t>
+            </w:r>
+          </w:p>
+        </w:tc>
+      </w:tr>
+      <w:tr>
+        <w:trPr>
+          <w:tblCellSpacing w:w="15" w:type="dxa"/>
+        </w:trPr>
+        <w:tc>
+          <w:tcPr>
+            <w:tcW w:w="0" w:type="auto"/>
+            <w:vAlign w:val="center"/>
+            <w:hideMark/>
+          </w:tcPr>
+          <w:p>
+            <w:pPr>
+              <w:pStyle w:val="ListParagraph"/>
+            </w:pPr>
+            <w:proofErr w:type="gramStart"/>
+            <w:r>
+              <w:t>contains(</w:t>
+            </w:r>
+            <w:proofErr w:type="gramEnd"/>
+            <w:r>
+              <w:t>)</w:t>
+            </w:r>
+          </w:p>
+        </w:tc>
+        <w:tc>
+          <w:tcPr>
+            <w:tcW w:w="0" w:type="auto"/>
+            <w:vAlign w:val="center"/>
+            <w:hideMark/>
+          </w:tcPr>
+          <w:p>
+            <w:pPr>
+              <w:pStyle w:val="ListParagraph"/>
+            </w:pPr>
+            <w:r>
+              <w:t>O(n)</w:t>
+            </w:r>
+          </w:p>
+        </w:tc>
+      </w:tr>
+    </w:tbl>
+    <w:p>
+      <w:pPr>
+        <w:pStyle w:val="ListParagraph"/>
+      </w:pPr>
+      <w:r>
+        <w:pict w14:anchorId="4DF3B55A">
+          <v:rect id="_x0000_i1366" style="width:0;height:1.5pt" o:hralign="center" o:hrstd="t" o:hr="t" fillcolor="#a0a0a0" stroked="f"/>
+        </w:pict>
+      </w:r>
+    </w:p>
+    <w:p>
+      <w:pPr>
+        <w:pStyle w:val="ListParagraph"/>
+        <w:rPr>
+          <w:b/>
+          <w:bCs/>
+        </w:rPr>
+      </w:pPr>
+      <w:r>
+        <w:rPr>
+          <w:b/>
+          <w:bCs/>
+        </w:rPr>
+        <w:t xml:space="preserve">15. Why is </w:t>
+      </w:r>
+      <w:proofErr w:type="spellStart"/>
+      <w:r>
+        <w:rPr>
+          <w:b/>
+          <w:bCs/>
+        </w:rPr>
+        <w:t>ArrayList</w:t>
+      </w:r>
+      <w:proofErr w:type="spellEnd"/>
+      <w:r>
+        <w:rPr>
+          <w:b/>
+          <w:bCs/>
+        </w:rPr>
+        <w:t xml:space="preserve"> called dynamic?</w:t>
+      </w:r>
+    </w:p>
+    <w:p>
+      <w:pPr>
+        <w:pStyle w:val="ListParagraph"/>
+      </w:pPr>
+      <w:r>
+        <w:rPr>
+          <w:b/>
+          <w:bCs/>
+        </w:rPr>
+        <w:t>Answer:</w:t>
+      </w:r>
+    </w:p>
+    <w:p>
+      <w:pPr>
+        <w:pStyle w:val="ListParagraph"/>
+      </w:pPr>
+      <w:r>
+        <w:t>Because it automatically increases its capacity when it becomes full.</w:t>
+      </w:r>
+    </w:p>
+    <w:p>
+      <w:pPr>
+        <w:pStyle w:val="ListParagraph"/>
+      </w:pPr>
+      <w:r>
+        <w:pict w14:anchorId="198114B1">
+          <v:rect id="_x0000_i1367" style="width:0;height:1.5pt" o:hralign="center" o:hrstd="t" o:hr="t" fillcolor="#a0a0a0" stroked="f"/>
+        </w:pict>
+      </w:r>
+    </w:p>
+    <w:p>
+      <w:pPr>
+        <w:pStyle w:val="ListParagraph"/>
+        <w:rPr>
+          <w:b/>
+          <w:bCs/>
+        </w:rPr>
+      </w:pPr>
+      <w:r>
+        <w:rPr>
+          <w:b/>
+          <w:bCs/>
+        </w:rPr>
+        <w:t xml:space="preserve">16. What happens when </w:t>
+      </w:r>
+      <w:proofErr w:type="spellStart"/>
+      <w:r>
+        <w:rPr>
+          <w:b/>
+          <w:bCs/>
+        </w:rPr>
+        <w:t>ArrayList</w:t>
+      </w:r>
+      <w:proofErr w:type="spellEnd"/>
+      <w:r>
+        <w:rPr>
+          <w:b/>
+          <w:bCs/>
+        </w:rPr>
+        <w:t xml:space="preserve"> becomes full?</w:t>
+      </w:r>
+    </w:p>
+    <w:p>
+      <w:pPr>
+        <w:pStyle w:val="ListParagraph"/>
+      </w:pPr>
+      <w:r>
+        <w:rPr>
+          <w:b/>
+          <w:bCs/>
+        </w:rPr>
+        <w:t>Answer:</w:t>
+      </w:r>
+    </w:p>
+    <w:p>
+      <w:pPr>
+        <w:pStyle w:val="ListParagraph"/>
+      </w:pPr>
+      <w:r>
+        <w:t>Java:</w:t>
+      </w:r>
+    </w:p>
+    <w:p>
+      <w:pPr>
+        <w:pStyle w:val="ListParagraph"/>
+        <w:numPr>
+          <w:ilvl w:val="0"/>
+          <w:numId w:val="4"/>
+        </w:numPr>
+      </w:pPr>
+      <w:r>
+        <w:t xml:space="preserve">Creates a larger internal array. </w:t>
+      </w:r>
+    </w:p>
+    <w:p>
+      <w:pPr>
+        <w:pStyle w:val="ListParagraph"/>
+        <w:numPr>
+          <w:ilvl w:val="0"/>
+          <w:numId w:val="4"/>
+        </w:numPr>
+      </w:pPr>
+      <w:r>
+        <w:t xml:space="preserve">Copies all existing elements to the new array. </w:t>
+      </w:r>
+    </w:p>
+    <w:p>
+      <w:pPr>
+        <w:pStyle w:val="ListParagraph"/>
+        <w:numPr>
+          <w:ilvl w:val="0"/>
+          <w:numId w:val="4"/>
+        </w:numPr>
+      </w:pPr>
+      <w:r>
+        <w:t xml:space="preserve">Adds the new element. </w:t>
+      </w:r>
+    </w:p>
+    <w:p>
+      <w:pPr>
+        <w:pStyle w:val="ListParagraph"/>
+        <w:numPr>
+          <w:ilvl w:val="0"/>
+          <w:numId w:val="4"/>
+        </w:numPr>
+      </w:pPr>
+      <w:r>
+        <w:t xml:space="preserve">Discards the old array. </w:t>
+      </w:r>
+    </w:p>
+    <w:p>
+      <w:pPr>
+        <w:pStyle w:val="ListParagraph"/>
+      </w:pPr>
+      <w:r>
+        <w:pict w14:anchorId="0803795C">
+          <v:rect id="_x0000_i1368" style="width:0;height:1.5pt" o:hralign="center" o:hrstd="t" o:hr="t" fillcolor="#a0a0a0" stroked="f"/>
+        </w:pict>
+      </w:r>
+    </w:p>
+    <w:p>
+      <w:pPr>
+        <w:pStyle w:val="ListParagraph"/>
+        <w:rPr>
+          <w:b/>
+          <w:bCs/>
+        </w:rPr>
+      </w:pPr>
+      <w:r>
+        <w:rPr>
+          <w:b/>
+          <w:bCs/>
+        </w:rPr>
+        <w:t xml:space="preserve">17. Which is faster: Array or </w:t>
+      </w:r>
+      <w:proofErr w:type="spellStart"/>
+      <w:r>
+        <w:rPr>
+          <w:b/>
+          <w:bCs/>
+        </w:rPr>
+        <w:t>ArrayList</w:t>
+      </w:r>
+      <w:proofErr w:type="spellEnd"/>
+      <w:r>
+        <w:rPr>
+          <w:b/>
+          <w:bCs/>
+        </w:rPr>
+        <w:t>?</w:t>
+      </w:r>
+    </w:p>
+    <w:p>
+      <w:pPr>
+        <w:pStyle w:val="ListParagraph"/>
+      </w:pPr>
+      <w:r>
+        <w:rPr>
+          <w:b/>
+          <w:bCs/>
+        </w:rPr>
+        <w:t>Answer:</w:t>
+      </w:r>
+    </w:p>
+    <w:p>
+      <w:pPr>
+        <w:pStyle w:val="ListParagraph"/>
+        <w:numPr>
+          <w:ilvl w:val="0"/>
+          <w:numId w:val="5"/>
+        </w:numPr>
+      </w:pPr>
+      <w:r>
+        <w:rPr>
+          <w:b/>
+          <w:bCs/>
+        </w:rPr>
+        <w:t>Array</w:t>
+      </w:r>
+      <w:r>
+        <w:t xml:space="preserve"> is generally faster because its size is fixed. </w:t>
+      </w:r>
+    </w:p>
+    <w:p>
+      <w:pPr>
+        <w:pStyle w:val="ListParagraph"/>
+        <w:numPr>
+          <w:ilvl w:val="0"/>
+          <w:numId w:val="5"/>
+        </w:numPr>
+      </w:pPr>
+      <w:proofErr w:type="spellStart"/>
+      <w:r>
+        <w:rPr>
+          <w:b/>
+          <w:bCs/>
+        </w:rPr>
+        <w:t>ArrayList</w:t>
+      </w:r>
+      <w:proofErr w:type="spellEnd"/>
+      <w:r>
+        <w:t xml:space="preserve"> is slightly slower because it may need to resize and copy elements.</w:t>
+      </w:r>
+    </w:p>
+    <w:p>
+      <w:pPr>
+        <w:pStyle w:val="ListParagraph"/>
+      </w:pPr>
+    </w:p>
+    <w:p>
+      <w:pPr>
+        <w:pStyle w:val="ListParagraph"/>
+      </w:pPr>
+    </w:p>
+    <w:p>
+      <w:pPr>
+        <w:pStyle w:val="ListParagraph"/>
+        <w:rPr>
+          <w:b/>
+          <w:bCs/>
+        </w:rPr>
+      </w:pPr>
+    </w:p>
+    <w:p>
+      <w:pPr>
+        <w:pStyle w:val="ListParagraph"/>
+        <w:rPr>
+          <w:b/>
+          <w:bCs/>
+        </w:rPr>
+      </w:pPr>
+    </w:p>
+    <w:p>
+      <w:pPr>
+        <w:pStyle w:val="ListParagraph"/>
+        <w:rPr>
+          <w:b/>
+          <w:bCs/>
+        </w:rPr>
+      </w:pPr>
+      <w:r>
+        <w:rPr>
+          <w:b/>
+          <w:bCs/>
+        </w:rPr>
+        <w:lastRenderedPageBreak/>
+        <w:t xml:space="preserve">Q. How many ways can you iterate through an </w:t>
+      </w:r>
+      <w:proofErr w:type="spellStart"/>
+      <w:r>
+        <w:rPr>
+          <w:b/>
+          <w:bCs/>
+        </w:rPr>
+        <w:t>ArrayList</w:t>
+      </w:r>
+      <w:proofErr w:type="spellEnd"/>
+      <w:r>
+        <w:rPr>
+          <w:b/>
+          <w:bCs/>
+        </w:rPr>
+        <w:t>?</w:t>
+      </w:r>
+    </w:p>
+    <w:p>
+      <w:pPr>
+        <w:pStyle w:val="ListParagraph"/>
+      </w:pPr>
+      <w:r>
+        <w:rPr>
+          <w:b/>
+          <w:bCs/>
+        </w:rPr>
+        <w:t>Answer:</w:t>
+      </w:r>
+    </w:p>
+    <w:p>
+      <w:pPr>
+        <w:pStyle w:val="ListParagraph"/>
+      </w:pPr>
+      <w:r>
+        <w:t xml:space="preserve">There are </w:t>
+      </w:r>
+      <w:r>
+        <w:rPr>
+          <w:b/>
+          <w:bCs/>
+        </w:rPr>
+        <w:t>four common ways</w:t>
+      </w:r>
+      <w:r>
+        <w:t xml:space="preserve"> to iterate through an </w:t>
+      </w:r>
+      <w:proofErr w:type="spellStart"/>
+      <w:r>
+        <w:t>ArrayList</w:t>
+      </w:r>
+      <w:proofErr w:type="spellEnd"/>
+      <w:r>
+        <w:t>:</w:t>
+      </w:r>
+    </w:p>
+    <w:p>
+      <w:pPr>
+        <w:pStyle w:val="ListParagraph"/>
+        <w:numPr>
+          <w:ilvl w:val="0"/>
+          <w:numId w:val="6"/>
+        </w:numPr>
+      </w:pPr>
+      <w:r>
+        <w:rPr>
+          <w:b/>
+          <w:bCs/>
+        </w:rPr>
+        <w:t>For Loop</w:t>
+      </w:r>
+      <w:r>
+        <w:t xml:space="preserve"> – Used when you need the index of elements. </w:t>
+      </w:r>
+    </w:p>
+    <w:p>
+      <w:pPr>
+        <w:pStyle w:val="ListParagraph"/>
+        <w:numPr>
+          <w:ilvl w:val="0"/>
+          <w:numId w:val="6"/>
+        </w:numPr>
+      </w:pPr>
+      <w:r>
+        <w:rPr>
+          <w:b/>
+          <w:bCs/>
+        </w:rPr>
+        <w:t>Enhanced For Loop (for-each)</w:t>
+      </w:r>
+      <w:r>
+        <w:t xml:space="preserve"> – Used for simple traversal when you only need to read elements. </w:t>
+      </w:r>
+    </w:p>
+    <w:p>
+      <w:pPr>
+        <w:pStyle w:val="ListParagraph"/>
+        <w:numPr>
+          <w:ilvl w:val="0"/>
+          <w:numId w:val="6"/>
+        </w:numPr>
+      </w:pPr>
+      <w:r>
+        <w:rPr>
+          <w:b/>
+          <w:bCs/>
+        </w:rPr>
+        <w:t>Iterator</w:t>
+      </w:r>
+      <w:r>
+        <w:t xml:space="preserve"> – Used for safe traversal and to remove elements while iterating. </w:t>
+      </w:r>
+    </w:p>
+    <w:p>
+      <w:pPr>
+        <w:pStyle w:val="ListParagraph"/>
+        <w:numPr>
+          <w:ilvl w:val="0"/>
+          <w:numId w:val="6"/>
+        </w:numPr>
+      </w:pPr>
+      <w:proofErr w:type="spellStart"/>
+      <w:r>
+        <w:rPr>
+          <w:b/>
+          <w:bCs/>
+        </w:rPr>
+        <w:t>ListIterator</w:t>
+      </w:r>
+      <w:proofErr w:type="spellEnd"/>
+      <w:r>
+        <w:t xml:space="preserve"> – Used to traverse both forward and backward, and it also allows modifying elements during iteration.</w:t>
+      </w:r>
+    </w:p>
+    <w:p>
+      <w:pPr>
+        <w:pStyle w:val="ListParagraph"/>
+      </w:pPr>
+    </w:p>
+    <w:p>
+      <w:pPr>
+        <w:pStyle w:val="ListParagraph"/>
+        <w:rPr>
+          <w:b/>
+          <w:bCs/>
+        </w:rPr>
+      </w:pPr>
+      <w:r>
+        <w:rPr>
+          <w:b/>
+          <w:bCs/>
+        </w:rPr>
+        <w:t>Q</w:t>
+      </w:r>
+      <w:r>
+        <w:rPr>
+          <w:b/>
+          <w:bCs/>
+        </w:rPr>
+        <w:t xml:space="preserve">. Difference between for loop and </w:t>
+      </w:r>
+      <w:proofErr w:type="gramStart"/>
+      <w:r>
+        <w:rPr>
+          <w:b/>
+          <w:bCs/>
+        </w:rPr>
+        <w:t>Enhanced</w:t>
+      </w:r>
+      <w:proofErr w:type="gramEnd"/>
+      <w:r>
+        <w:rPr>
+          <w:b/>
+          <w:bCs/>
+        </w:rPr>
+        <w:t xml:space="preserve"> for loop?</w:t>
+      </w:r>
+    </w:p>
+    <w:tbl>
+      <w:tblPr>
+        <w:tblW w:w="0" w:type="auto"/>
+        <w:tblCellSpacing w:w="15" w:type="dxa"/>
+        <w:tblCellMar>
+          <w:top w:w="15" w:type="dxa"/>
+          <w:left w:w="15" w:type="dxa"/>
+          <w:bottom w:w="15" w:type="dxa"/>
+          <w:right w:w="15" w:type="dxa"/>
+        </w:tblCellMar>
+        <w:tblLook w:val="04A0" w:firstRow="1" w:lastRow="0" w:firstColumn="1" w:lastColumn="0" w:noHBand="0" w:noVBand="1"/>
+      </w:tblPr>
+      <w:tblGrid>
+        <w:gridCol w:w="4239"/>
+        <w:gridCol w:w="4787"/>
+      </w:tblGrid>
+      <w:tr>
+        <w:trPr>
+          <w:tblHeader/>
+          <w:tblCellSpacing w:w="15" w:type="dxa"/>
+        </w:trPr>
+        <w:tc>
+          <w:tcPr>
+            <w:tcW w:w="0" w:type="auto"/>
+            <w:vAlign w:val="center"/>
+            <w:hideMark/>
+          </w:tcPr>
+          <w:p>
+            <w:pPr>
+              <w:pStyle w:val="ListParagraph"/>
+              <w:rPr>
+                <w:b/>
+                <w:bCs/>
+              </w:rPr>
+            </w:pPr>
+            <w:r>
+              <w:rPr>
+                <w:b/>
+                <w:bCs/>
+              </w:rPr>
+              <w:t>For Loop</w:t>
+            </w:r>
+          </w:p>
+        </w:tc>
+        <w:tc>
+          <w:tcPr>
+            <w:tcW w:w="0" w:type="auto"/>
+            <w:vAlign w:val="center"/>
+            <w:hideMark/>
+          </w:tcPr>
+          <w:p>
+            <w:pPr>
+              <w:pStyle w:val="ListParagraph"/>
+              <w:rPr>
+                <w:b/>
+                <w:bCs/>
+              </w:rPr>
+            </w:pPr>
+            <w:r>
+              <w:rPr>
+                <w:b/>
+                <w:bCs/>
+              </w:rPr>
+              <w:t>Enhanced For Loop (for-each)</w:t>
+            </w:r>
+          </w:p>
+        </w:tc>
+      </w:tr>
+      <w:tr>
+        <w:trPr>
+          <w:tblCellSpacing w:w="15" w:type="dxa"/>
+        </w:trPr>
+        <w:tc>
+          <w:tcPr>
+            <w:tcW w:w="0" w:type="auto"/>
+            <w:vAlign w:val="center"/>
+            <w:hideMark/>
+          </w:tcPr>
+          <w:p>
+            <w:pPr>
+              <w:pStyle w:val="ListParagraph"/>
+            </w:pPr>
+            <w:r>
+              <w:t xml:space="preserve">Used to iterate using the </w:t>
+            </w:r>
+            <w:r>
+              <w:rPr>
+                <w:b/>
+                <w:bCs/>
+              </w:rPr>
+              <w:t>index</w:t>
+            </w:r>
+            <w:r>
+              <w:t>.</w:t>
+            </w:r>
+          </w:p>
+        </w:tc>
+        <w:tc>
+          <w:tcPr>
+            <w:tcW w:w="0" w:type="auto"/>
+            <w:vAlign w:val="center"/>
+            <w:hideMark/>
+          </w:tcPr>
+          <w:p>
+            <w:pPr>
+              <w:pStyle w:val="ListParagraph"/>
+            </w:pPr>
+            <w:r>
+              <w:t>Used to iterate through elements directly.</w:t>
+            </w:r>
+          </w:p>
+        </w:tc>
+      </w:tr>
+      <w:tr>
+        <w:trPr>
+          <w:tblCellSpacing w:w="15" w:type="dxa"/>
+        </w:trPr>
+        <w:tc>
+          <w:tcPr>
+            <w:tcW w:w="0" w:type="auto"/>
+            <w:vAlign w:val="center"/>
+            <w:hideMark/>
+          </w:tcPr>
+          <w:p>
+            <w:pPr>
+              <w:pStyle w:val="ListParagraph"/>
+            </w:pPr>
+            <w:r>
+              <w:t>Can access elements by index using get(</w:t>
+            </w:r>
+            <w:proofErr w:type="spellStart"/>
+            <w:r>
+              <w:t>i</w:t>
+            </w:r>
+            <w:proofErr w:type="spellEnd"/>
+            <w:r>
+              <w:t>).</w:t>
+            </w:r>
+          </w:p>
+        </w:tc>
+        <w:tc>
+          <w:tcPr>
+            <w:tcW w:w="0" w:type="auto"/>
+            <w:vAlign w:val="center"/>
+            <w:hideMark/>
+          </w:tcPr>
+          <w:p>
+            <w:pPr>
+              <w:pStyle w:val="ListParagraph"/>
+            </w:pPr>
+            <w:r>
+              <w:t>Does not provide the index.</w:t>
+            </w:r>
+          </w:p>
+        </w:tc>
+      </w:tr>
+      <w:tr>
+        <w:trPr>
+          <w:tblCellSpacing w:w="15" w:type="dxa"/>
+        </w:trPr>
+        <w:tc>
+          <w:tcPr>
+            <w:tcW w:w="0" w:type="auto"/>
+            <w:vAlign w:val="center"/>
+            <w:hideMark/>
+          </w:tcPr>
+          <w:p>
+            <w:pPr>
+              <w:pStyle w:val="ListParagraph"/>
+            </w:pPr>
+            <w:r>
+              <w:t>Can update elements using the index.</w:t>
+            </w:r>
+          </w:p>
+        </w:tc>
+        <w:tc>
+          <w:tcPr>
+            <w:tcW w:w="0" w:type="auto"/>
+            <w:vAlign w:val="center"/>
+            <w:hideMark/>
+          </w:tcPr>
+          <w:p>
+            <w:pPr>
+              <w:pStyle w:val="ListParagraph"/>
+            </w:pPr>
+            <w:r>
+              <w:t>Mainly used for reading elements.</w:t>
+            </w:r>
+          </w:p>
+        </w:tc>
+      </w:tr>
+      <w:tr>
+        <w:trPr>
+          <w:tblCellSpacing w:w="15" w:type="dxa"/>
+        </w:trPr>
+        <w:tc>
+          <w:tcPr>
+            <w:tcW w:w="0" w:type="auto"/>
+            <w:vAlign w:val="center"/>
+            <w:hideMark/>
+          </w:tcPr>
+          <w:p>
+            <w:pPr>
+              <w:pStyle w:val="ListParagraph"/>
+            </w:pPr>
+            <w:r>
+              <w:t>Best when you need the element's position.</w:t>
+            </w:r>
+          </w:p>
+        </w:tc>
+        <w:tc>
+          <w:tcPr>
+            <w:tcW w:w="0" w:type="auto"/>
+            <w:vAlign w:val="center"/>
+            <w:hideMark/>
+          </w:tcPr>
+          <w:p>
+            <w:pPr>
+              <w:pStyle w:val="ListParagraph"/>
+            </w:pPr>
+            <w:r>
+              <w:t>Best when you only need to traverse the collection.</w:t>
+            </w:r>
+            <w:r>
+              <w:t xml:space="preserve">                                                        </w:t>
+            </w:r>
+          </w:p>
+        </w:tc>
+      </w:tr>
+    </w:tbl>
+    <w:p>
+      <w:pPr>
+        <w:pStyle w:val="ListParagraph"/>
+        <w:rPr>
+          <w:b/>
+          <w:bCs/>
+        </w:rPr>
+      </w:pPr>
+    </w:p>
+    <w:p>
+      <w:pPr>
+        <w:pStyle w:val="ListParagraph"/>
+        <w:rPr>
+          <w:b/>
+          <w:bCs/>
+        </w:rPr>
+      </w:pPr>
+      <w:r>
+        <w:rPr>
+          <w:b/>
+          <w:bCs/>
+        </w:rPr>
+        <w:t>Q.</w:t>
+      </w:r>
+      <w:r>
+        <w:rPr>
+          <w:b/>
+          <w:bCs/>
+        </w:rPr>
+        <w:t xml:space="preserve"> </w:t>
+      </w:r>
+      <w:r>
+        <w:rPr>
+          <w:b/>
+          <w:bCs/>
+        </w:rPr>
+        <w:t>What is an Iterator</w:t>
+      </w:r>
+    </w:p>
+    <w:p>
+      <w:pPr>
+        <w:pStyle w:val="ListParagraph"/>
+        <w:rPr>
+          <w:b/>
+          <w:bCs/>
+        </w:rPr>
+      </w:pPr>
+    </w:p>
+    <w:p>
+      <w:pPr>
+        <w:pStyle w:val="ListParagraph"/>
+      </w:pPr>
+      <w:r>
+        <w:t>Iterator is an interface used to traverse (iterate through) the elements of a collection one by one. It also allows us to safely remove elements during traversal.</w:t>
+      </w:r>
+    </w:p>
+    <w:p>
+      <w:pPr>
+        <w:pStyle w:val="ListParagraph"/>
+      </w:pPr>
+    </w:p>
+    <w:p>
+      <w:pPr>
+        <w:pStyle w:val="ListParagraph"/>
+      </w:pPr>
+      <w:r>
+        <w:rPr>
+          <w:b/>
+          <w:bCs/>
+        </w:rPr>
+        <w:t>Q. Why do we use an Iterator instead of a for loop?</w:t>
+      </w:r>
+    </w:p>
+    <w:p>
+      <w:pPr>
+        <w:pStyle w:val="ListParagraph"/>
+      </w:pPr>
+      <w:r>
+        <w:rPr>
+          <w:b/>
+          <w:bCs/>
+        </w:rPr>
+        <w:t>Answer:</w:t>
+      </w:r>
+    </w:p>
+    <w:p>
+      <w:pPr>
+        <w:pStyle w:val="ListParagraph"/>
+      </w:pPr>
+      <w:r>
+        <w:t xml:space="preserve">We use an Iterator to safely traverse a collection and remove elements during iteration without causing a </w:t>
+      </w:r>
+      <w:proofErr w:type="spellStart"/>
+      <w:r>
+        <w:t>ConcurrentModificationException</w:t>
+      </w:r>
+      <w:proofErr w:type="spellEnd"/>
+      <w:r>
+        <w:t>.</w:t>
+      </w:r>
+    </w:p>
+    <w:p>
+      <w:pPr>
+        <w:pStyle w:val="ListParagraph"/>
+      </w:pPr>
+    </w:p>
+    <w:p>
+      <w:pPr>
+        <w:pStyle w:val="ListParagraph"/>
+        <w:rPr>
+          <w:b/>
+          <w:bCs/>
+        </w:rPr>
+      </w:pPr>
+      <w:r>
+        <w:rPr>
+          <w:b/>
+          <w:bCs/>
+        </w:rPr>
+        <w:t>1. What is an Iterator?</w:t>
+      </w:r>
+    </w:p>
+    <w:p>
+      <w:pPr>
+        <w:pStyle w:val="ListParagraph"/>
+      </w:pPr>
+      <w:r>
+        <w:rPr>
+          <w:b/>
+          <w:bCs/>
+        </w:rPr>
+        <w:t>Answer:</w:t>
+      </w:r>
+    </w:p>
+    <w:p>
+      <w:pPr>
+        <w:pStyle w:val="ListParagraph"/>
+      </w:pPr>
+      <w:r>
+        <w:t>Iterator is an interface in the Java Collections Framework used to traverse elements of a collection one by one. It also allows safe removal of elements during traversal.</w:t>
+      </w:r>
+    </w:p>
+    <w:p>
+      <w:pPr>
+        <w:pStyle w:val="ListParagraph"/>
+      </w:pPr>
+      <w:r>
+        <w:pict w14:anchorId="2A623E5E">
+          <v:rect id="_x0000_i1431" style="width:0;height:1.5pt" o:hralign="center" o:hrstd="t" o:hr="t" fillcolor="#a0a0a0" stroked="f"/>
+        </w:pict>
+      </w:r>
+    </w:p>
+    <w:p>
+      <w:pPr>
+        <w:pStyle w:val="ListParagraph"/>
+        <w:rPr>
+          <w:b/>
+          <w:bCs/>
+        </w:rPr>
+      </w:pPr>
+      <w:r>
+        <w:rPr>
+          <w:b/>
+          <w:bCs/>
+        </w:rPr>
+        <w:lastRenderedPageBreak/>
+        <w:t>2. Why do we use an Iterator?</w:t>
+      </w:r>
+    </w:p>
+    <w:p>
+      <w:pPr>
+        <w:pStyle w:val="ListParagraph"/>
+      </w:pPr>
+      <w:r>
+        <w:rPr>
+          <w:b/>
+          <w:bCs/>
+        </w:rPr>
+        <w:t>Answer:</w:t>
+      </w:r>
+    </w:p>
+    <w:p>
+      <w:pPr>
+        <w:pStyle w:val="ListParagraph"/>
+      </w:pPr>
+      <w:r>
+        <w:t xml:space="preserve">We use an Iterator to traverse a collection safely. It is especially useful when removing elements during iteration because it avoids </w:t>
+      </w:r>
+      <w:proofErr w:type="spellStart"/>
+      <w:r>
+        <w:t>ConcurrentModificationException</w:t>
+      </w:r>
+      <w:proofErr w:type="spellEnd"/>
+      <w:r>
+        <w:t>.</w:t>
+      </w:r>
+    </w:p>
+    <w:p>
+      <w:pPr>
+        <w:pStyle w:val="ListParagraph"/>
+      </w:pPr>
+      <w:r>
+        <w:pict w14:anchorId="15FF5D6A">
+          <v:rect id="_x0000_i1432" style="width:0;height:1.5pt" o:hralign="center" o:hrstd="t" o:hr="t" fillcolor="#a0a0a0" stroked="f"/>
+        </w:pict>
+      </w:r>
+    </w:p>
+    <w:p>
+      <w:pPr>
+        <w:pStyle w:val="ListParagraph"/>
+        <w:rPr>
+          <w:b/>
+          <w:bCs/>
+        </w:rPr>
+      </w:pPr>
+      <w:r>
+        <w:rPr>
+          <w:b/>
+          <w:bCs/>
+        </w:rPr>
+        <w:t>3. Which package contains Iterator?</w:t>
+      </w:r>
+    </w:p>
+    <w:p>
+      <w:pPr>
+        <w:pStyle w:val="ListParagraph"/>
+      </w:pPr>
+      <w:r>
+        <w:rPr>
+          <w:b/>
+          <w:bCs/>
+        </w:rPr>
+        <w:t>Answer:</w:t>
+      </w:r>
+    </w:p>
+    <w:p>
+      <w:pPr>
+        <w:pStyle w:val="ListParagraph"/>
+      </w:pPr>
+      <w:proofErr w:type="spellStart"/>
+      <w:proofErr w:type="gramStart"/>
+      <w:r>
+        <w:t>java.util</w:t>
+      </w:r>
+      <w:proofErr w:type="spellEnd"/>
+      <w:proofErr w:type="gramEnd"/>
+    </w:p>
+    <w:p>
+      <w:pPr>
+        <w:pStyle w:val="ListParagraph"/>
+      </w:pPr>
+      <w:r>
+        <w:pict w14:anchorId="00AF6701">
+          <v:rect id="_x0000_i1433" style="width:0;height:1.5pt" o:hralign="center" o:hrstd="t" o:hr="t" fillcolor="#a0a0a0" stroked="f"/>
+        </w:pict>
+      </w:r>
+    </w:p>
+    <w:p>
+      <w:pPr>
+        <w:pStyle w:val="ListParagraph"/>
+        <w:rPr>
+          <w:b/>
+          <w:bCs/>
+        </w:rPr>
+      </w:pPr>
+      <w:r>
+        <w:rPr>
+          <w:b/>
+          <w:bCs/>
+        </w:rPr>
+        <w:t>4. What are the main methods of Iterator?</w:t>
+      </w:r>
+    </w:p>
+    <w:p>
+      <w:pPr>
+        <w:pStyle w:val="ListParagraph"/>
+      </w:pPr>
+      <w:r>
+        <w:rPr>
+          <w:b/>
+          <w:bCs/>
+        </w:rPr>
+        <w:t>Answer:</w:t>
+      </w:r>
+    </w:p>
+    <w:p>
+      <w:pPr>
+        <w:pStyle w:val="ListParagraph"/>
+        <w:numPr>
+          <w:ilvl w:val="0"/>
+          <w:numId w:val="7"/>
+        </w:numPr>
+      </w:pPr>
+      <w:proofErr w:type="spellStart"/>
+      <w:proofErr w:type="gramStart"/>
+      <w:r>
+        <w:t>hasNext</w:t>
+      </w:r>
+      <w:proofErr w:type="spellEnd"/>
+      <w:r>
+        <w:t>(</w:t>
+      </w:r>
+      <w:proofErr w:type="gramEnd"/>
+      <w:r>
+        <w:t xml:space="preserve">) → Checks if another element exists. </w:t>
+      </w:r>
+    </w:p>
+    <w:p>
+      <w:pPr>
+        <w:pStyle w:val="ListParagraph"/>
+        <w:numPr>
+          <w:ilvl w:val="0"/>
+          <w:numId w:val="7"/>
+        </w:numPr>
+      </w:pPr>
+      <w:proofErr w:type="gramStart"/>
+      <w:r>
+        <w:t>next(</w:t>
+      </w:r>
+      <w:proofErr w:type="gramEnd"/>
+      <w:r>
+        <w:t xml:space="preserve">) → Returns the next element. </w:t>
+      </w:r>
+    </w:p>
+    <w:p>
+      <w:pPr>
+        <w:pStyle w:val="ListParagraph"/>
+        <w:numPr>
+          <w:ilvl w:val="0"/>
+          <w:numId w:val="7"/>
+        </w:numPr>
+      </w:pPr>
+      <w:proofErr w:type="gramStart"/>
+      <w:r>
+        <w:t>remove(</w:t>
+      </w:r>
+      <w:proofErr w:type="gramEnd"/>
+      <w:r>
+        <w:t xml:space="preserve">) → Removes the current element safely. </w:t>
+      </w:r>
+    </w:p>
+    <w:p>
+      <w:pPr>
+        <w:pStyle w:val="ListParagraph"/>
+      </w:pPr>
+      <w:r>
+        <w:pict w14:anchorId="640F4D61">
+          <v:rect id="_x0000_i1434" style="width:0;height:1.5pt" o:hralign="center" o:hrstd="t" o:hr="t" fillcolor="#a0a0a0" stroked="f"/>
+        </w:pict>
+      </w:r>
+    </w:p>
+    <w:p>
+      <w:pPr>
+        <w:pStyle w:val="ListParagraph"/>
+        <w:rPr>
+          <w:b/>
+          <w:bCs/>
+        </w:rPr>
+      </w:pPr>
+      <w:r>
+        <w:rPr>
+          <w:b/>
+          <w:bCs/>
+        </w:rPr>
+        <w:t xml:space="preserve">5. What is the difference between </w:t>
+      </w:r>
+      <w:proofErr w:type="spellStart"/>
+      <w:proofErr w:type="gramStart"/>
+      <w:r>
+        <w:rPr>
+          <w:b/>
+          <w:bCs/>
+        </w:rPr>
+        <w:t>hasNext</w:t>
+      </w:r>
+      <w:proofErr w:type="spellEnd"/>
+      <w:r>
+        <w:rPr>
+          <w:b/>
+          <w:bCs/>
+        </w:rPr>
+        <w:t>(</w:t>
+      </w:r>
+      <w:proofErr w:type="gramEnd"/>
+      <w:r>
+        <w:rPr>
+          <w:b/>
+          <w:bCs/>
+        </w:rPr>
+        <w:t xml:space="preserve">) and </w:t>
+      </w:r>
+      <w:proofErr w:type="gramStart"/>
+      <w:r>
+        <w:rPr>
+          <w:b/>
+          <w:bCs/>
+        </w:rPr>
+        <w:t>next(</w:t>
+      </w:r>
+      <w:proofErr w:type="gramEnd"/>
+      <w:r>
+        <w:rPr>
+          <w:b/>
+          <w:bCs/>
+        </w:rPr>
+        <w:t>)?</w:t>
+      </w:r>
+    </w:p>
+    <w:p>
+      <w:pPr>
+        <w:pStyle w:val="ListParagraph"/>
+      </w:pPr>
+      <w:r>
+        <w:rPr>
+          <w:b/>
+          <w:bCs/>
+        </w:rPr>
+        <w:t>Answer:</w:t>
+      </w:r>
+    </w:p>
+    <w:tbl>
+      <w:tblPr>
+        <w:tblW w:w="0" w:type="auto"/>
+        <w:tblCellSpacing w:w="15" w:type="dxa"/>
+        <w:tblCellMar>
+          <w:top w:w="15" w:type="dxa"/>
+          <w:left w:w="15" w:type="dxa"/>
+          <w:bottom w:w="15" w:type="dxa"/>
+          <w:right w:w="15" w:type="dxa"/>
+        </w:tblCellMar>
+        <w:tblLook w:val="04A0" w:firstRow="1" w:lastRow="0" w:firstColumn="1" w:lastColumn="0" w:noHBand="0" w:noVBand="1"/>
+      </w:tblPr>
+      <w:tblGrid>
+        <w:gridCol w:w="5407"/>
+        <w:gridCol w:w="3619"/>
+      </w:tblGrid>
+      <w:tr>
+        <w:trPr>
+          <w:tblHeader/>
+          <w:tblCellSpacing w:w="15" w:type="dxa"/>
+        </w:trPr>
+        <w:tc>
+          <w:tcPr>
+            <w:tcW w:w="0" w:type="auto"/>
+            <w:vAlign w:val="center"/>
+            <w:hideMark/>
+          </w:tcPr>
+          <w:p>
+            <w:pPr>
+              <w:pStyle w:val="ListParagraph"/>
+              <w:rPr>
+                <w:b/>
+                <w:bCs/>
+              </w:rPr>
+            </w:pPr>
+            <w:proofErr w:type="spellStart"/>
+            <w:proofErr w:type="gramStart"/>
+            <w:r>
+              <w:rPr>
+                <w:b/>
+                <w:bCs/>
+              </w:rPr>
+              <w:t>hasNext</w:t>
+            </w:r>
+            <w:proofErr w:type="spellEnd"/>
+            <w:r>
+              <w:rPr>
+                <w:b/>
+                <w:bCs/>
+              </w:rPr>
+              <w:t>(</w:t>
+            </w:r>
+            <w:proofErr w:type="gramEnd"/>
+            <w:r>
+              <w:rPr>
+                <w:b/>
+                <w:bCs/>
+              </w:rPr>
+              <w:t>)</w:t>
+            </w:r>
+          </w:p>
+        </w:tc>
+        <w:tc>
+          <w:tcPr>
+            <w:tcW w:w="0" w:type="auto"/>
+            <w:vAlign w:val="center"/>
+            <w:hideMark/>
+          </w:tcPr>
+          <w:p>
+            <w:pPr>
+              <w:pStyle w:val="ListParagraph"/>
+              <w:rPr>
+                <w:b/>
+                <w:bCs/>
+              </w:rPr>
+            </w:pPr>
+            <w:proofErr w:type="gramStart"/>
+            <w:r>
+              <w:rPr>
+                <w:b/>
+                <w:bCs/>
+              </w:rPr>
+              <w:t>next(</w:t>
+            </w:r>
+            <w:proofErr w:type="gramEnd"/>
+            <w:r>
+              <w:rPr>
+                <w:b/>
+                <w:bCs/>
+              </w:rPr>
+              <w:t>)</w:t>
+            </w:r>
+          </w:p>
+        </w:tc>
+      </w:tr>
+      <w:tr>
+        <w:trPr>
+          <w:tblCellSpacing w:w="15" w:type="dxa"/>
+        </w:trPr>
+        <w:tc>
+          <w:tcPr>
+            <w:tcW w:w="0" w:type="auto"/>
+            <w:vAlign w:val="center"/>
+            <w:hideMark/>
+          </w:tcPr>
+          <w:p>
+            <w:pPr>
+              <w:pStyle w:val="ListParagraph"/>
+            </w:pPr>
+            <w:r>
+              <w:t>Checks whether another element is available.</w:t>
+            </w:r>
+          </w:p>
+        </w:tc>
+        <w:tc>
+          <w:tcPr>
+            <w:tcW w:w="0" w:type="auto"/>
+            <w:vAlign w:val="center"/>
+            <w:hideMark/>
+          </w:tcPr>
+          <w:p>
+            <w:pPr>
+              <w:pStyle w:val="ListParagraph"/>
+            </w:pPr>
+            <w:r>
+              <w:t>Returns the next element.</w:t>
+            </w:r>
+          </w:p>
+        </w:tc>
+      </w:tr>
+      <w:tr>
+        <w:trPr>
+          <w:tblCellSpacing w:w="15" w:type="dxa"/>
+        </w:trPr>
+        <w:tc>
+          <w:tcPr>
+            <w:tcW w:w="0" w:type="auto"/>
+            <w:vAlign w:val="center"/>
+            <w:hideMark/>
+          </w:tcPr>
+          <w:p>
+            <w:pPr>
+              <w:pStyle w:val="ListParagraph"/>
+            </w:pPr>
+            <w:r>
+              <w:t>Returns true or false.</w:t>
+            </w:r>
+          </w:p>
+        </w:tc>
+        <w:tc>
+          <w:tcPr>
+            <w:tcW w:w="0" w:type="auto"/>
+            <w:vAlign w:val="center"/>
+            <w:hideMark/>
+          </w:tcPr>
+          <w:p>
+            <w:pPr>
+              <w:pStyle w:val="ListParagraph"/>
+            </w:pPr>
+            <w:r>
+              <w:t>Returns the actual element.</w:t>
+            </w:r>
+          </w:p>
+        </w:tc>
+      </w:tr>
+    </w:tbl>
+    <w:p>
+      <w:pPr>
+        <w:pStyle w:val="ListParagraph"/>
+      </w:pPr>
+      <w:r>
+        <w:pict w14:anchorId="3A186F09">
+          <v:rect id="_x0000_i1435" style="width:0;height:1.5pt" o:hralign="center" o:hrstd="t" o:hr="t" fillcolor="#a0a0a0" stroked="f"/>
+        </w:pict>
+      </w:r>
+    </w:p>
+    <w:p>
+      <w:pPr>
+        <w:pStyle w:val="ListParagraph"/>
+        <w:rPr>
+          <w:b/>
+          <w:bCs/>
+        </w:rPr>
+      </w:pPr>
+      <w:r>
+        <w:rPr>
+          <w:b/>
+          <w:bCs/>
+        </w:rPr>
+        <w:t>6. Can Iterator move backward?</w:t>
+      </w:r>
+    </w:p>
+    <w:p>
+      <w:pPr>
+        <w:pStyle w:val="ListParagraph"/>
+      </w:pPr>
+      <w:r>
+        <w:rPr>
+          <w:b/>
+          <w:bCs/>
+        </w:rPr>
+        <w:t>Answer:</w:t>
+      </w:r>
+    </w:p>
+    <w:p>
+      <w:pPr>
+        <w:pStyle w:val="ListParagraph"/>
+      </w:pPr>
+      <w:r>
+        <w:rPr>
+          <w:rFonts w:ascii="Segoe UI Emoji" w:hAnsi="Segoe UI Emoji" w:cs="Segoe UI Emoji"/>
+        </w:rPr>
+        <w:t>❌</w:t>
+      </w:r>
+      <w:r>
+        <w:t xml:space="preserve"> No.</w:t>
+      </w:r>
+    </w:p>
+    <w:p>
+      <w:pPr>
+        <w:pStyle w:val="ListParagraph"/>
+      </w:pPr>
+      <w:r>
+        <w:t xml:space="preserve">It can only move </w:t>
+      </w:r>
+      <w:r>
+        <w:rPr>
+          <w:b/>
+          <w:bCs/>
+        </w:rPr>
+        <w:t>forward</w:t>
+      </w:r>
+      <w:r>
+        <w:t>.</w:t>
+      </w:r>
+    </w:p>
+    <w:p>
+      <w:pPr>
+        <w:pStyle w:val="ListParagraph"/>
+      </w:pPr>
+      <w:r>
+        <w:pict w14:anchorId="566887AE">
+          <v:rect id="_x0000_i1436" style="width:0;height:1.5pt" o:hralign="center" o:hrstd="t" o:hr="t" fillcolor="#a0a0a0" stroked="f"/>
+        </w:pict>
+      </w:r>
+    </w:p>
+    <w:p>
+      <w:pPr>
+        <w:pStyle w:val="ListParagraph"/>
+        <w:rPr>
+          <w:b/>
+          <w:bCs/>
+        </w:rPr>
+      </w:pPr>
+      <w:r>
+        <w:rPr>
+          <w:b/>
+          <w:bCs/>
+        </w:rPr>
+        <w:t>7. Can Iterator add elements?</w:t>
+      </w:r>
+    </w:p>
+    <w:p>
+      <w:pPr>
+        <w:pStyle w:val="ListParagraph"/>
+      </w:pPr>
+      <w:r>
+        <w:rPr>
+          <w:b/>
+          <w:bCs/>
+        </w:rPr>
+        <w:t>Answer:</w:t>
+      </w:r>
+    </w:p>
+    <w:p>
+      <w:pPr>
+        <w:pStyle w:val="ListParagraph"/>
+      </w:pPr>
+      <w:r>
+        <w:rPr>
+          <w:rFonts w:ascii="Segoe UI Emoji" w:hAnsi="Segoe UI Emoji" w:cs="Segoe UI Emoji"/>
+        </w:rPr>
+        <w:t>❌</w:t>
+      </w:r>
+      <w:r>
+        <w:t xml:space="preserve"> No.</w:t>
+      </w:r>
+    </w:p>
+    <w:p>
+      <w:pPr>
+        <w:pStyle w:val="ListParagraph"/>
+      </w:pPr>
+      <w:r>
+        <w:t>Iterator does not support adding elements.</w:t>
+      </w:r>
+    </w:p>
+    <w:p>
+      <w:pPr>
+        <w:pStyle w:val="ListParagraph"/>
+      </w:pPr>
+      <w:r>
+        <w:pict w14:anchorId="032A0F22">
+          <v:rect id="_x0000_i1437" style="width:0;height:1.5pt" o:hralign="center" o:hrstd="t" o:hr="t" fillcolor="#a0a0a0" stroked="f"/>
+        </w:pict>
+      </w:r>
+    </w:p>
+    <w:p>
+      <w:pPr>
+        <w:pStyle w:val="ListParagraph"/>
+        <w:rPr>
+          <w:b/>
+          <w:bCs/>
+        </w:rPr>
+      </w:pPr>
+      <w:r>
+        <w:rPr>
+          <w:b/>
+          <w:bCs/>
+        </w:rPr>
+        <w:t>8. Can Iterator update elements?</w:t>
+      </w:r>
+    </w:p>
+    <w:p>
+      <w:pPr>
+        <w:pStyle w:val="ListParagraph"/>
+      </w:pPr>
+      <w:r>
+        <w:rPr>
+          <w:b/>
+          <w:bCs/>
+        </w:rPr>
+        <w:t>Answer:</w:t>
+      </w:r>
+    </w:p>
+    <w:p>
+      <w:pPr>
+        <w:pStyle w:val="ListParagraph"/>
+      </w:pPr>
+      <w:r>
+        <w:rPr>
+          <w:rFonts w:ascii="Segoe UI Emoji" w:hAnsi="Segoe UI Emoji" w:cs="Segoe UI Emoji"/>
+        </w:rPr>
+        <w:t>❌</w:t>
+      </w:r>
+      <w:r>
+        <w:t xml:space="preserve"> No.</w:t>
+      </w:r>
+    </w:p>
+    <w:p>
+      <w:pPr>
+        <w:pStyle w:val="ListParagraph"/>
+      </w:pPr>
+      <w:r>
+        <w:t xml:space="preserve">Iterator cannot update elements. To modify elements during traversal, use a </w:t>
+      </w:r>
+      <w:proofErr w:type="spellStart"/>
+      <w:r>
+        <w:rPr>
+          <w:b/>
+          <w:bCs/>
+        </w:rPr>
+        <w:t>ListIterator</w:t>
+      </w:r>
+      <w:proofErr w:type="spellEnd"/>
+      <w:r>
+        <w:t>.</w:t>
+      </w:r>
+    </w:p>
+    <w:p>
+      <w:pPr>
+        <w:pStyle w:val="ListParagraph"/>
+      </w:pPr>
+      <w:r>
+        <w:lastRenderedPageBreak/>
+        <w:pict w14:anchorId="7F93348F">
+          <v:rect id="_x0000_i1438" style="width:0;height:1.5pt" o:hralign="center" o:hrstd="t" o:hr="t" fillcolor="#a0a0a0" stroked="f"/>
+        </w:pict>
+      </w:r>
+    </w:p>
+    <w:p>
+      <w:pPr>
+        <w:pStyle w:val="ListParagraph"/>
+        <w:rPr>
+          <w:b/>
+          <w:bCs/>
+        </w:rPr>
+      </w:pPr>
+      <w:r>
+        <w:rPr>
+          <w:b/>
+          <w:bCs/>
+        </w:rPr>
+        <w:t>9. Can Iterator remove elements?</w:t>
+      </w:r>
+    </w:p>
+    <w:p>
+      <w:pPr>
+        <w:pStyle w:val="ListParagraph"/>
+      </w:pPr>
+      <w:r>
+        <w:rPr>
+          <w:b/>
+          <w:bCs/>
+        </w:rPr>
+        <w:t>Answer:</w:t>
+      </w:r>
+    </w:p>
+    <w:p>
+      <w:pPr>
+        <w:pStyle w:val="ListParagraph"/>
+      </w:pPr>
+      <w:r>
+        <w:rPr>
+          <w:rFonts w:ascii="Segoe UI Emoji" w:hAnsi="Segoe UI Emoji" w:cs="Segoe UI Emoji"/>
+        </w:rPr>
+        <w:t>✅</w:t>
+      </w:r>
+      <w:r>
+        <w:t xml:space="preserve"> Yes.</w:t>
+      </w:r>
+    </w:p>
+    <w:p>
+      <w:pPr>
+        <w:pStyle w:val="ListParagraph"/>
+      </w:pPr>
+      <w:r>
+        <w:t xml:space="preserve">It provides the </w:t>
+      </w:r>
+      <w:proofErr w:type="gramStart"/>
+      <w:r>
+        <w:t>remove(</w:t>
+      </w:r>
+      <w:proofErr w:type="gramEnd"/>
+      <w:r>
+        <w:t>) method for safe removal during iteration.</w:t>
+      </w:r>
+    </w:p>
+    <w:p>
+      <w:pPr>
+        <w:pStyle w:val="ListParagraph"/>
+      </w:pPr>
+      <w:r>
+        <w:pict w14:anchorId="4D544E68">
+          <v:rect id="_x0000_i1439" style="width:0;height:1.5pt" o:hralign="center" o:hrstd="t" o:hr="t" fillcolor="#a0a0a0" stroked="f"/>
+        </w:pict>
+      </w:r>
+    </w:p>
+    <w:p>
+      <w:pPr>
+        <w:pStyle w:val="ListParagraph"/>
+        <w:rPr>
+          <w:b/>
+          <w:bCs/>
+        </w:rPr>
+      </w:pPr>
+      <w:r>
+        <w:rPr>
+          <w:b/>
+          <w:bCs/>
+        </w:rPr>
+        <w:t xml:space="preserve">10. Difference between Iterator and </w:t>
+      </w:r>
+      <w:proofErr w:type="spellStart"/>
+      <w:r>
+        <w:rPr>
+          <w:b/>
+          <w:bCs/>
+        </w:rPr>
+        <w:t>ListIterator</w:t>
+      </w:r>
+      <w:proofErr w:type="spellEnd"/>
+      <w:r>
+        <w:rPr>
+          <w:b/>
+          <w:bCs/>
+        </w:rPr>
+        <w:t>?</w:t>
+      </w:r>
+    </w:p>
+    <w:tbl>
+      <w:tblPr>
+        <w:tblW w:w="0" w:type="auto"/>
+        <w:tblCellSpacing w:w="15" w:type="dxa"/>
+        <w:tblCellMar>
+          <w:top w:w="15" w:type="dxa"/>
+          <w:left w:w="15" w:type="dxa"/>
+          <w:bottom w:w="15" w:type="dxa"/>
+          <w:right w:w="15" w:type="dxa"/>
+        </w:tblCellMar>
+        <w:tblLook w:val="04A0" w:firstRow="1" w:lastRow="0" w:firstColumn="1" w:lastColumn="0" w:noHBand="0" w:noVBand="1"/>
+      </w:tblPr>
+      <w:tblGrid>
+        <w:gridCol w:w="3473"/>
+        <w:gridCol w:w="4860"/>
+      </w:tblGrid>
+      <w:tr>
+        <w:trPr>
+          <w:tblHeader/>
+          <w:tblCellSpacing w:w="15" w:type="dxa"/>
+        </w:trPr>
+        <w:tc>
+          <w:tcPr>
+            <w:tcW w:w="0" w:type="auto"/>
+            <w:vAlign w:val="center"/>
+            <w:hideMark/>
+          </w:tcPr>
+          <w:p>
+            <w:pPr>
+              <w:pStyle w:val="ListParagraph"/>
+              <w:rPr>
+                <w:b/>
+                <w:bCs/>
+              </w:rPr>
+            </w:pPr>
+            <w:r>
+              <w:rPr>
+                <w:b/>
+                <w:bCs/>
+              </w:rPr>
+              <w:t>Iterator</w:t>
+            </w:r>
+          </w:p>
+        </w:tc>
+        <w:tc>
+          <w:tcPr>
+            <w:tcW w:w="0" w:type="auto"/>
+            <w:vAlign w:val="center"/>
+            <w:hideMark/>
+          </w:tcPr>
+          <w:p>
+            <w:pPr>
+              <w:pStyle w:val="ListParagraph"/>
+              <w:rPr>
+                <w:b/>
+                <w:bCs/>
+              </w:rPr>
+            </w:pPr>
+            <w:proofErr w:type="spellStart"/>
+            <w:r>
+              <w:rPr>
+                <w:b/>
+                <w:bCs/>
+              </w:rPr>
+              <w:t>ListIterator</w:t>
+            </w:r>
+            <w:proofErr w:type="spellEnd"/>
+          </w:p>
+        </w:tc>
+      </w:tr>
+      <w:tr>
+        <w:trPr>
+          <w:tblCellSpacing w:w="15" w:type="dxa"/>
+        </w:trPr>
+        <w:tc>
+          <w:tcPr>
+            <w:tcW w:w="0" w:type="auto"/>
+            <w:vAlign w:val="center"/>
+            <w:hideMark/>
+          </w:tcPr>
+          <w:p>
+            <w:pPr>
+              <w:pStyle w:val="ListParagraph"/>
+            </w:pPr>
+            <w:r>
+              <w:t>Moves only forward</w:t>
+            </w:r>
+          </w:p>
+        </w:tc>
+        <w:tc>
+          <w:tcPr>
+            <w:tcW w:w="0" w:type="auto"/>
+            <w:vAlign w:val="center"/>
+            <w:hideMark/>
+          </w:tcPr>
+          <w:p>
+            <w:pPr>
+              <w:pStyle w:val="ListParagraph"/>
+            </w:pPr>
+            <w:r>
+              <w:t>Moves forward and backward</w:t>
+            </w:r>
+          </w:p>
+        </w:tc>
+      </w:tr>
+      <w:tr>
+        <w:trPr>
+          <w:tblCellSpacing w:w="15" w:type="dxa"/>
+        </w:trPr>
+        <w:tc>
+          <w:tcPr>
+            <w:tcW w:w="0" w:type="auto"/>
+            <w:vAlign w:val="center"/>
+            <w:hideMark/>
+          </w:tcPr>
+          <w:p>
+            <w:pPr>
+              <w:pStyle w:val="ListParagraph"/>
+            </w:pPr>
+            <w:r>
+              <w:t>Can remove elements</w:t>
+            </w:r>
+          </w:p>
+        </w:tc>
+        <w:tc>
+          <w:tcPr>
+            <w:tcW w:w="0" w:type="auto"/>
+            <w:vAlign w:val="center"/>
+            <w:hideMark/>
+          </w:tcPr>
+          <w:p>
+            <w:pPr>
+              <w:pStyle w:val="ListParagraph"/>
+            </w:pPr>
+            <w:r>
+              <w:t>Can add, remove, and update elements</w:t>
+            </w:r>
+          </w:p>
+        </w:tc>
+      </w:tr>
+      <w:tr>
+        <w:trPr>
+          <w:tblCellSpacing w:w="15" w:type="dxa"/>
+        </w:trPr>
+        <w:tc>
+          <w:tcPr>
+            <w:tcW w:w="0" w:type="auto"/>
+            <w:vAlign w:val="center"/>
+            <w:hideMark/>
+          </w:tcPr>
+          <w:p>
+            <w:pPr>
+              <w:pStyle w:val="ListParagraph"/>
+            </w:pPr>
+            <w:r>
+              <w:t>Works with all Collections</w:t>
+            </w:r>
+          </w:p>
+        </w:tc>
+        <w:tc>
+          <w:tcPr>
+            <w:tcW w:w="0" w:type="auto"/>
+            <w:vAlign w:val="center"/>
+            <w:hideMark/>
+          </w:tcPr>
+          <w:p>
+            <w:pPr>
+              <w:pStyle w:val="ListParagraph"/>
+            </w:pPr>
+            <w:r>
+              <w:t>Works only with List implementations</w:t>
+            </w:r>
+          </w:p>
+        </w:tc>
+      </w:tr>
+    </w:tbl>
+    <w:p>
+      <w:pPr>
+        <w:pStyle w:val="ListParagraph"/>
+      </w:pPr>
+    </w:p>
+    <w:p>
+      <w:pPr>
+        <w:pStyle w:val="ListParagraph"/>
+      </w:pPr>
     </w:p>
     <w:sectPr>
       <w:pgSz w:w="11906" w:h="16838"/>
@@ -497,9 +4254,881 @@
 </w:document>
 </file>
 
+<file path=word/endnotes.xml><?xml version="1.0" encoding="utf-8"?>
+<w:endnotes xmlns:wpc="http://schemas.microsoft.com/office/word/2010/wordprocessingCanvas" xmlns:cx="http://schemas.microsoft.com/office/drawing/2014/chartex" xmlns:cx1="http://schemas.microsoft.com/office/drawing/2015/9/8/chartex" xmlns:cx2="http://schemas.microsoft.com/office/drawing/2015/10/21/chartex" xmlns:cx3="http://schemas.microsoft.com/office/drawing/2016/5/9/chartex" xmlns:cx4="http://schemas.microsoft.com/office/drawing/2016/5/10/chartex" xmlns:cx5="http://schemas.microsoft.com/office/drawing/2016/5/11/chartex" xmlns:cx6="http://schemas.microsoft.com/office/drawing/2016/5/12/chartex" xmlns:cx7="http://schemas.microsoft.com/office/drawing/2016/5/13/chartex" xmlns:cx8="http://schemas.microsoft.com/office/drawing/2016/5/14/chartex" xmlns:mc="http://schemas.openxmlformats.org/markup-compatibility/2006" xmlns:aink="http://schemas.microsoft.com/office/drawing/2016/ink" xmlns:am3d="http://schemas.microsoft.com/office/drawing/2017/model3d" xmlns:o="urn:schemas-microsoft-com:office:office" xmlns:oel="http://schemas.microsoft.com/office/2019/extlst" xmlns:r="http://schemas.openxmlformats.org/officeDocument/2006/relationships" xmlns:m="http://schemas.openxmlformats.org/officeDocument/2006/math" xmlns:v="urn:schemas-microsoft-com:vml" xmlns:wp14="http://schemas.microsoft.com/office/word/2010/wordprocessingDrawing" xmlns:wp="http://schemas.openxmlformats.org/drawingml/2006/wordprocessingDrawing" xmlns:w10="urn:schemas-microsoft-com:office:word" xmlns:w="http://schemas.openxmlformats.org/wordprocessingml/2006/main" xmlns:w14="http://schemas.microsoft.com/office/word/2010/wordml" xmlns:w15="http://schemas.microsoft.com/office/word/2012/wordml" xmlns:w16cex="http://schemas.microsoft.com/office/word/2018/wordml/cex" xmlns:w16cid="http://schemas.microsoft.com/office/word/2016/wordml/cid" xmlns:w16="http://schemas.microsoft.com/office/word/2018/wordml" xmlns:w16du="http://schemas.microsoft.com/office/word/2023/wordml/word16du" xmlns:w16sdtdh="http://schemas.microsoft.com/office/word/2020/wordml/sdtdatahash" xmlns:w16sdtfl="http://schemas.microsoft.com/office/word/2024/wordml/sdtformatlock" xmlns:w16se="http://schemas.microsoft.com/office/word/2015/wordml/symex" xmlns:wpg="http://schemas.microsoft.com/office/word/2010/wordprocessingGroup" xmlns:wpi="http://schemas.microsoft.com/office/word/2010/wordprocessingInk" xmlns:wne="http://schemas.microsoft.com/office/word/2006/wordml" xmlns:wps="http://schemas.microsoft.com/office/word/2010/wordprocessingShape" mc:Ignorable="w14 w15 w16se w16cid w16 w16cex w16sdtdh w16sdtfl w16du wp14">
+  <w:endnote w:type="separator" w:id="-1">
+    <w:p>
+      <w:pPr>
+        <w:spacing w:after="0" w:line="240" w:lineRule="auto"/>
+      </w:pPr>
+      <w:r>
+        <w:separator/>
+      </w:r>
+    </w:p>
+  </w:endnote>
+  <w:endnote w:type="continuationSeparator" w:id="0">
+    <w:p>
+      <w:pPr>
+        <w:spacing w:after="0" w:line="240" w:lineRule="auto"/>
+      </w:pPr>
+      <w:r>
+        <w:continuationSeparator/>
+      </w:r>
+    </w:p>
+  </w:endnote>
+</w:endnotes>
+</file>
+
+<file path=word/footnotes.xml><?xml version="1.0" encoding="utf-8"?>
+<w:footnotes xmlns:wpc="http://schemas.microsoft.com/office/word/2010/wordprocessingCanvas" xmlns:cx="http://schemas.microsoft.com/office/drawing/2014/chartex" xmlns:cx1="http://schemas.microsoft.com/office/drawing/2015/9/8/chartex" xmlns:cx2="http://schemas.microsoft.com/office/drawing/2015/10/21/chartex" xmlns:cx3="http://schemas.microsoft.com/office/drawing/2016/5/9/chartex" xmlns:cx4="http://schemas.microsoft.com/office/drawing/2016/5/10/chartex" xmlns:cx5="http://schemas.microsoft.com/office/drawing/2016/5/11/chartex" xmlns:cx6="http://schemas.microsoft.com/office/drawing/2016/5/12/chartex" xmlns:cx7="http://schemas.microsoft.com/office/drawing/2016/5/13/chartex" xmlns:cx8="http://schemas.microsoft.com/office/drawing/2016/5/14/chartex" xmlns:mc="http://schemas.openxmlformats.org/markup-compatibility/2006" xmlns:aink="http://schemas.microsoft.com/office/drawing/2016/ink" xmlns:am3d="http://schemas.microsoft.com/office/drawing/2017/model3d" xmlns:o="urn:schemas-microsoft-com:office:office" xmlns:oel="http://schemas.microsoft.com/office/2019/extlst" xmlns:r="http://schemas.openxmlformats.org/officeDocument/2006/relationships" xmlns:m="http://schemas.openxmlformats.org/officeDocument/2006/math" xmlns:v="urn:schemas-microsoft-com:vml" xmlns:wp14="http://schemas.microsoft.com/office/word/2010/wordprocessingDrawing" xmlns:wp="http://schemas.openxmlformats.org/drawingml/2006/wordprocessingDrawing" xmlns:w10="urn:schemas-microsoft-com:office:word" xmlns:w="http://schemas.openxmlformats.org/wordprocessingml/2006/main" xmlns:w14="http://schemas.microsoft.com/office/word/2010/wordml" xmlns:w15="http://schemas.microsoft.com/office/word/2012/wordml" xmlns:w16cex="http://schemas.microsoft.com/office/word/2018/wordml/cex" xmlns:w16cid="http://schemas.microsoft.com/office/word/2016/wordml/cid" xmlns:w16="http://schemas.microsoft.com/office/word/2018/wordml" xmlns:w16du="http://schemas.microsoft.com/office/word/2023/wordml/word16du" xmlns:w16sdtdh="http://schemas.microsoft.com/office/word/2020/wordml/sdtdatahash" xmlns:w16sdtfl="http://schemas.microsoft.com/office/word/2024/wordml/sdtformatlock" xmlns:w16se="http://schemas.microsoft.com/office/word/2015/wordml/symex" xmlns:wpg="http://schemas.microsoft.com/office/word/2010/wordprocessingGroup" xmlns:wpi="http://schemas.microsoft.com/office/word/2010/wordprocessingInk" xmlns:wne="http://schemas.microsoft.com/office/word/2006/wordml" xmlns:wps="http://schemas.microsoft.com/office/word/2010/wordprocessingShape" mc:Ignorable="w14 w15 w16se w16cid w16 w16cex w16sdtdh w16sdtfl w16du wp14">
+  <w:footnote w:type="separator" w:id="-1">
+    <w:p>
+      <w:pPr>
+        <w:spacing w:after="0" w:line="240" w:lineRule="auto"/>
+      </w:pPr>
+      <w:r>
+        <w:separator/>
+      </w:r>
+    </w:p>
+  </w:footnote>
+  <w:footnote w:type="continuationSeparator" w:id="0">
+    <w:p>
+      <w:pPr>
+        <w:spacing w:after="0" w:line="240" w:lineRule="auto"/>
+      </w:pPr>
+      <w:r>
+        <w:continuationSeparator/>
+      </w:r>
+    </w:p>
+  </w:footnote>
+</w:footnotes>
+</file>
+
 <file path=word/numbering.xml><?xml version="1.0" encoding="utf-8"?>
 <w:numbering xmlns:wpc="http://schemas.microsoft.com/office/word/2010/wordprocessingCanvas" xmlns:cx="http://schemas.microsoft.com/office/drawing/2014/chartex" xmlns:cx1="http://schemas.microsoft.com/office/drawing/2015/9/8/chartex" xmlns:cx2="http://schemas.microsoft.com/office/drawing/2015/10/21/chartex" xmlns:cx3="http://schemas.microsoft.com/office/drawing/2016/5/9/chartex" xmlns:cx4="http://schemas.microsoft.com/office/drawing/2016/5/10/chartex" xmlns:cx5="http://schemas.microsoft.com/office/drawing/2016/5/11/chartex" xmlns:cx6="http://schemas.microsoft.com/office/drawing/2016/5/12/chartex" xmlns:cx7="http://schemas.microsoft.com/office/drawing/2016/5/13/chartex" xmlns:cx8="http://schemas.microsoft.com/office/drawing/2016/5/14/chartex" xmlns:mc="http://schemas.openxmlformats.org/markup-compatibility/2006" xmlns:aink="http://schemas.microsoft.com/office/drawing/2016/ink" xmlns:am3d="http://schemas.microsoft.com/office/drawing/2017/model3d" xmlns:o="urn:schemas-microsoft-com:office:office" xmlns:oel="http://schemas.microsoft.com/office/2019/extlst" xmlns:r="http://schemas.openxmlformats.org/officeDocument/2006/relationships" xmlns:m="http://schemas.openxmlformats.org/officeDocument/2006/math" xmlns:v="urn:schemas-microsoft-com:vml" xmlns:wp14="http://schemas.microsoft.com/office/word/2010/wordprocessingDrawing" xmlns:wp="http://schemas.openxmlformats.org/drawingml/2006/wordprocessingDrawing" xmlns:w10="urn:schemas-microsoft-com:office:word" xmlns:w="http://schemas.openxmlformats.org/wordprocessingml/2006/main" xmlns:w14="http://schemas.microsoft.com/office/word/2010/wordml" xmlns:w15="http://schemas.microsoft.com/office/word/2012/wordml" xmlns:w16cex="http://schemas.microsoft.com/office/word/2018/wordml/cex" xmlns:w16cid="http://schemas.microsoft.com/office/word/2016/wordml/cid" xmlns:w16="http://schemas.microsoft.com/office/word/2018/wordml" xmlns:w16du="http://schemas.microsoft.com/office/word/2023/wordml/word16du" xmlns:w16sdtdh="http://schemas.microsoft.com/office/word/2020/wordml/sdtdatahash" xmlns:w16sdtfl="http://schemas.microsoft.com/office/word/2024/wordml/sdtformatlock" xmlns:w16se="http://schemas.microsoft.com/office/word/2015/wordml/symex" xmlns:wpg="http://schemas.microsoft.com/office/word/2010/wordprocessingGroup" xmlns:wpi="http://schemas.microsoft.com/office/word/2010/wordprocessingInk" xmlns:wne="http://schemas.microsoft.com/office/word/2006/wordml" xmlns:wps="http://schemas.microsoft.com/office/word/2010/wordprocessingShape" mc:Ignorable="w14 w15 w16se w16cid w16 w16cex w16sdtdh w16sdtfl w16du wp14">
   <w:abstractNum w:abstractNumId="0" w15:restartNumberingAfterBreak="0">
+    <w:nsid w:val="03E62D9B"/>
+    <w:multiLevelType w:val="multilevel"/>
+    <w:tmpl w:val="9644335E"/>
+    <w:lvl w:ilvl="0">
+      <w:start w:val="1"/>
+      <w:numFmt w:val="decimal"/>
+      <w:lvlText w:val="%1."/>
+      <w:lvlJc w:val="left"/>
+      <w:pPr>
+        <w:tabs>
+          <w:tab w:val="num" w:pos="720"/>
+        </w:tabs>
+        <w:ind w:left="720" w:hanging="360"/>
+      </w:pPr>
+    </w:lvl>
+    <w:lvl w:ilvl="1" w:tentative="1">
+      <w:start w:val="1"/>
+      <w:numFmt w:val="decimal"/>
+      <w:lvlText w:val="%2."/>
+      <w:lvlJc w:val="left"/>
+      <w:pPr>
+        <w:tabs>
+          <w:tab w:val="num" w:pos="1440"/>
+        </w:tabs>
+        <w:ind w:left="1440" w:hanging="360"/>
+      </w:pPr>
+    </w:lvl>
+    <w:lvl w:ilvl="2" w:tentative="1">
+      <w:start w:val="1"/>
+      <w:numFmt w:val="decimal"/>
+      <w:lvlText w:val="%3."/>
+      <w:lvlJc w:val="left"/>
+      <w:pPr>
+        <w:tabs>
+          <w:tab w:val="num" w:pos="2160"/>
+        </w:tabs>
+        <w:ind w:left="2160" w:hanging="360"/>
+      </w:pPr>
+    </w:lvl>
+    <w:lvl w:ilvl="3" w:tentative="1">
+      <w:start w:val="1"/>
+      <w:numFmt w:val="decimal"/>
+      <w:lvlText w:val="%4."/>
+      <w:lvlJc w:val="left"/>
+      <w:pPr>
+        <w:tabs>
+          <w:tab w:val="num" w:pos="2880"/>
+        </w:tabs>
+        <w:ind w:left="2880" w:hanging="360"/>
+      </w:pPr>
+    </w:lvl>
+    <w:lvl w:ilvl="4" w:tentative="1">
+      <w:start w:val="1"/>
+      <w:numFmt w:val="decimal"/>
+      <w:lvlText w:val="%5."/>
+      <w:lvlJc w:val="left"/>
+      <w:pPr>
+        <w:tabs>
+          <w:tab w:val="num" w:pos="3600"/>
+        </w:tabs>
+        <w:ind w:left="3600" w:hanging="360"/>
+      </w:pPr>
+    </w:lvl>
+    <w:lvl w:ilvl="5" w:tentative="1">
+      <w:start w:val="1"/>
+      <w:numFmt w:val="decimal"/>
+      <w:lvlText w:val="%6."/>
+      <w:lvlJc w:val="left"/>
+      <w:pPr>
+        <w:tabs>
+          <w:tab w:val="num" w:pos="4320"/>
+        </w:tabs>
+        <w:ind w:left="4320" w:hanging="360"/>
+      </w:pPr>
+    </w:lvl>
+    <w:lvl w:ilvl="6" w:tentative="1">
+      <w:start w:val="1"/>
+      <w:numFmt w:val="decimal"/>
+      <w:lvlText w:val="%7."/>
+      <w:lvlJc w:val="left"/>
+      <w:pPr>
+        <w:tabs>
+          <w:tab w:val="num" w:pos="5040"/>
+        </w:tabs>
+        <w:ind w:left="5040" w:hanging="360"/>
+      </w:pPr>
+    </w:lvl>
+    <w:lvl w:ilvl="7" w:tentative="1">
+      <w:start w:val="1"/>
+      <w:numFmt w:val="decimal"/>
+      <w:lvlText w:val="%8."/>
+      <w:lvlJc w:val="left"/>
+      <w:pPr>
+        <w:tabs>
+          <w:tab w:val="num" w:pos="5760"/>
+        </w:tabs>
+        <w:ind w:left="5760" w:hanging="360"/>
+      </w:pPr>
+    </w:lvl>
+    <w:lvl w:ilvl="8" w:tentative="1">
+      <w:start w:val="1"/>
+      <w:numFmt w:val="decimal"/>
+      <w:lvlText w:val="%9."/>
+      <w:lvlJc w:val="left"/>
+      <w:pPr>
+        <w:tabs>
+          <w:tab w:val="num" w:pos="6480"/>
+        </w:tabs>
+        <w:ind w:left="6480" w:hanging="360"/>
+      </w:pPr>
+    </w:lvl>
+  </w:abstractNum>
+  <w:abstractNum w:abstractNumId="1" w15:restartNumberingAfterBreak="0">
+    <w:nsid w:val="0F0A31D9"/>
+    <w:multiLevelType w:val="multilevel"/>
+    <w:tmpl w:val="11C89C0C"/>
+    <w:lvl w:ilvl="0">
+      <w:start w:val="1"/>
+      <w:numFmt w:val="bullet"/>
+      <w:lvlText w:val=""/>
+      <w:lvlJc w:val="left"/>
+      <w:pPr>
+        <w:tabs>
+          <w:tab w:val="num" w:pos="720"/>
+        </w:tabs>
+        <w:ind w:left="720" w:hanging="360"/>
+      </w:pPr>
+      <w:rPr>
+        <w:rFonts w:ascii="Symbol" w:hAnsi="Symbol" w:hint="default"/>
+        <w:sz w:val="20"/>
+      </w:rPr>
+    </w:lvl>
+    <w:lvl w:ilvl="1" w:tentative="1">
+      <w:start w:val="1"/>
+      <w:numFmt w:val="bullet"/>
+      <w:lvlText w:val="o"/>
+      <w:lvlJc w:val="left"/>
+      <w:pPr>
+        <w:tabs>
+          <w:tab w:val="num" w:pos="1440"/>
+        </w:tabs>
+        <w:ind w:left="1440" w:hanging="360"/>
+      </w:pPr>
+      <w:rPr>
+        <w:rFonts w:ascii="Courier New" w:hAnsi="Courier New" w:hint="default"/>
+        <w:sz w:val="20"/>
+      </w:rPr>
+    </w:lvl>
+    <w:lvl w:ilvl="2" w:tentative="1">
+      <w:start w:val="1"/>
+      <w:numFmt w:val="bullet"/>
+      <w:lvlText w:val=""/>
+      <w:lvlJc w:val="left"/>
+      <w:pPr>
+        <w:tabs>
+          <w:tab w:val="num" w:pos="2160"/>
+        </w:tabs>
+        <w:ind w:left="2160" w:hanging="360"/>
+      </w:pPr>
+      <w:rPr>
+        <w:rFonts w:ascii="Wingdings" w:hAnsi="Wingdings" w:hint="default"/>
+        <w:sz w:val="20"/>
+      </w:rPr>
+    </w:lvl>
+    <w:lvl w:ilvl="3" w:tentative="1">
+      <w:start w:val="1"/>
+      <w:numFmt w:val="bullet"/>
+      <w:lvlText w:val=""/>
+      <w:lvlJc w:val="left"/>
+      <w:pPr>
+        <w:tabs>
+          <w:tab w:val="num" w:pos="2880"/>
+        </w:tabs>
+        <w:ind w:left="2880" w:hanging="360"/>
+      </w:pPr>
+      <w:rPr>
+        <w:rFonts w:ascii="Wingdings" w:hAnsi="Wingdings" w:hint="default"/>
+        <w:sz w:val="20"/>
+      </w:rPr>
+    </w:lvl>
+    <w:lvl w:ilvl="4" w:tentative="1">
+      <w:start w:val="1"/>
+      <w:numFmt w:val="bullet"/>
+      <w:lvlText w:val=""/>
+      <w:lvlJc w:val="left"/>
+      <w:pPr>
+        <w:tabs>
+          <w:tab w:val="num" w:pos="3600"/>
+        </w:tabs>
+        <w:ind w:left="3600" w:hanging="360"/>
+      </w:pPr>
+      <w:rPr>
+        <w:rFonts w:ascii="Wingdings" w:hAnsi="Wingdings" w:hint="default"/>
+        <w:sz w:val="20"/>
+      </w:rPr>
+    </w:lvl>
+    <w:lvl w:ilvl="5" w:tentative="1">
+      <w:start w:val="1"/>
+      <w:numFmt w:val="bullet"/>
+      <w:lvlText w:val=""/>
+      <w:lvlJc w:val="left"/>
+      <w:pPr>
+        <w:tabs>
+          <w:tab w:val="num" w:pos="4320"/>
+        </w:tabs>
+        <w:ind w:left="4320" w:hanging="360"/>
+      </w:pPr>
+      <w:rPr>
+        <w:rFonts w:ascii="Wingdings" w:hAnsi="Wingdings" w:hint="default"/>
+        <w:sz w:val="20"/>
+      </w:rPr>
+    </w:lvl>
+    <w:lvl w:ilvl="6" w:tentative="1">
+      <w:start w:val="1"/>
+      <w:numFmt w:val="bullet"/>
+      <w:lvlText w:val=""/>
+      <w:lvlJc w:val="left"/>
+      <w:pPr>
+        <w:tabs>
+          <w:tab w:val="num" w:pos="5040"/>
+        </w:tabs>
+        <w:ind w:left="5040" w:hanging="360"/>
+      </w:pPr>
+      <w:rPr>
+        <w:rFonts w:ascii="Wingdings" w:hAnsi="Wingdings" w:hint="default"/>
+        <w:sz w:val="20"/>
+      </w:rPr>
+    </w:lvl>
+    <w:lvl w:ilvl="7" w:tentative="1">
+      <w:start w:val="1"/>
+      <w:numFmt w:val="bullet"/>
+      <w:lvlText w:val=""/>
+      <w:lvlJc w:val="left"/>
+      <w:pPr>
+        <w:tabs>
+          <w:tab w:val="num" w:pos="5760"/>
+        </w:tabs>
+        <w:ind w:left="5760" w:hanging="360"/>
+      </w:pPr>
+      <w:rPr>
+        <w:rFonts w:ascii="Wingdings" w:hAnsi="Wingdings" w:hint="default"/>
+        <w:sz w:val="20"/>
+      </w:rPr>
+    </w:lvl>
+    <w:lvl w:ilvl="8" w:tentative="1">
+      <w:start w:val="1"/>
+      <w:numFmt w:val="bullet"/>
+      <w:lvlText w:val=""/>
+      <w:lvlJc w:val="left"/>
+      <w:pPr>
+        <w:tabs>
+          <w:tab w:val="num" w:pos="6480"/>
+        </w:tabs>
+        <w:ind w:left="6480" w:hanging="360"/>
+      </w:pPr>
+      <w:rPr>
+        <w:rFonts w:ascii="Wingdings" w:hAnsi="Wingdings" w:hint="default"/>
+        <w:sz w:val="20"/>
+      </w:rPr>
+    </w:lvl>
+  </w:abstractNum>
+  <w:abstractNum w:abstractNumId="2" w15:restartNumberingAfterBreak="0">
+    <w:nsid w:val="11B91DB5"/>
+    <w:multiLevelType w:val="multilevel"/>
+    <w:tmpl w:val="DDBADB74"/>
+    <w:lvl w:ilvl="0">
+      <w:start w:val="1"/>
+      <w:numFmt w:val="bullet"/>
+      <w:lvlText w:val=""/>
+      <w:lvlJc w:val="left"/>
+      <w:pPr>
+        <w:tabs>
+          <w:tab w:val="num" w:pos="720"/>
+        </w:tabs>
+        <w:ind w:left="720" w:hanging="360"/>
+      </w:pPr>
+      <w:rPr>
+        <w:rFonts w:ascii="Symbol" w:hAnsi="Symbol" w:hint="default"/>
+        <w:sz w:val="20"/>
+      </w:rPr>
+    </w:lvl>
+    <w:lvl w:ilvl="1" w:tentative="1">
+      <w:start w:val="1"/>
+      <w:numFmt w:val="bullet"/>
+      <w:lvlText w:val="o"/>
+      <w:lvlJc w:val="left"/>
+      <w:pPr>
+        <w:tabs>
+          <w:tab w:val="num" w:pos="1440"/>
+        </w:tabs>
+        <w:ind w:left="1440" w:hanging="360"/>
+      </w:pPr>
+      <w:rPr>
+        <w:rFonts w:ascii="Courier New" w:hAnsi="Courier New" w:hint="default"/>
+        <w:sz w:val="20"/>
+      </w:rPr>
+    </w:lvl>
+    <w:lvl w:ilvl="2" w:tentative="1">
+      <w:start w:val="1"/>
+      <w:numFmt w:val="bullet"/>
+      <w:lvlText w:val=""/>
+      <w:lvlJc w:val="left"/>
+      <w:pPr>
+        <w:tabs>
+          <w:tab w:val="num" w:pos="2160"/>
+        </w:tabs>
+        <w:ind w:left="2160" w:hanging="360"/>
+      </w:pPr>
+      <w:rPr>
+        <w:rFonts w:ascii="Wingdings" w:hAnsi="Wingdings" w:hint="default"/>
+        <w:sz w:val="20"/>
+      </w:rPr>
+    </w:lvl>
+    <w:lvl w:ilvl="3" w:tentative="1">
+      <w:start w:val="1"/>
+      <w:numFmt w:val="bullet"/>
+      <w:lvlText w:val=""/>
+      <w:lvlJc w:val="left"/>
+      <w:pPr>
+        <w:tabs>
+          <w:tab w:val="num" w:pos="2880"/>
+        </w:tabs>
+        <w:ind w:left="2880" w:hanging="360"/>
+      </w:pPr>
+      <w:rPr>
+        <w:rFonts w:ascii="Wingdings" w:hAnsi="Wingdings" w:hint="default"/>
+        <w:sz w:val="20"/>
+      </w:rPr>
+    </w:lvl>
+    <w:lvl w:ilvl="4" w:tentative="1">
+      <w:start w:val="1"/>
+      <w:numFmt w:val="bullet"/>
+      <w:lvlText w:val=""/>
+      <w:lvlJc w:val="left"/>
+      <w:pPr>
+        <w:tabs>
+          <w:tab w:val="num" w:pos="3600"/>
+        </w:tabs>
+        <w:ind w:left="3600" w:hanging="360"/>
+      </w:pPr>
+      <w:rPr>
+        <w:rFonts w:ascii="Wingdings" w:hAnsi="Wingdings" w:hint="default"/>
+        <w:sz w:val="20"/>
+      </w:rPr>
+    </w:lvl>
+    <w:lvl w:ilvl="5" w:tentative="1">
+      <w:start w:val="1"/>
+      <w:numFmt w:val="bullet"/>
+      <w:lvlText w:val=""/>
+      <w:lvlJc w:val="left"/>
+      <w:pPr>
+        <w:tabs>
+          <w:tab w:val="num" w:pos="4320"/>
+        </w:tabs>
+        <w:ind w:left="4320" w:hanging="360"/>
+      </w:pPr>
+      <w:rPr>
+        <w:rFonts w:ascii="Wingdings" w:hAnsi="Wingdings" w:hint="default"/>
+        <w:sz w:val="20"/>
+      </w:rPr>
+    </w:lvl>
+    <w:lvl w:ilvl="6" w:tentative="1">
+      <w:start w:val="1"/>
+      <w:numFmt w:val="bullet"/>
+      <w:lvlText w:val=""/>
+      <w:lvlJc w:val="left"/>
+      <w:pPr>
+        <w:tabs>
+          <w:tab w:val="num" w:pos="5040"/>
+        </w:tabs>
+        <w:ind w:left="5040" w:hanging="360"/>
+      </w:pPr>
+      <w:rPr>
+        <w:rFonts w:ascii="Wingdings" w:hAnsi="Wingdings" w:hint="default"/>
+        <w:sz w:val="20"/>
+      </w:rPr>
+    </w:lvl>
+    <w:lvl w:ilvl="7" w:tentative="1">
+      <w:start w:val="1"/>
+      <w:numFmt w:val="bullet"/>
+      <w:lvlText w:val=""/>
+      <w:lvlJc w:val="left"/>
+      <w:pPr>
+        <w:tabs>
+          <w:tab w:val="num" w:pos="5760"/>
+        </w:tabs>
+        <w:ind w:left="5760" w:hanging="360"/>
+      </w:pPr>
+      <w:rPr>
+        <w:rFonts w:ascii="Wingdings" w:hAnsi="Wingdings" w:hint="default"/>
+        <w:sz w:val="20"/>
+      </w:rPr>
+    </w:lvl>
+    <w:lvl w:ilvl="8" w:tentative="1">
+      <w:start w:val="1"/>
+      <w:numFmt w:val="bullet"/>
+      <w:lvlText w:val=""/>
+      <w:lvlJc w:val="left"/>
+      <w:pPr>
+        <w:tabs>
+          <w:tab w:val="num" w:pos="6480"/>
+        </w:tabs>
+        <w:ind w:left="6480" w:hanging="360"/>
+      </w:pPr>
+      <w:rPr>
+        <w:rFonts w:ascii="Wingdings" w:hAnsi="Wingdings" w:hint="default"/>
+        <w:sz w:val="20"/>
+      </w:rPr>
+    </w:lvl>
+  </w:abstractNum>
+  <w:abstractNum w:abstractNumId="3" w15:restartNumberingAfterBreak="0">
+    <w:nsid w:val="23FD6185"/>
+    <w:multiLevelType w:val="multilevel"/>
+    <w:tmpl w:val="FA868248"/>
+    <w:lvl w:ilvl="0">
+      <w:start w:val="1"/>
+      <w:numFmt w:val="decimal"/>
+      <w:lvlText w:val="%1."/>
+      <w:lvlJc w:val="left"/>
+      <w:pPr>
+        <w:tabs>
+          <w:tab w:val="num" w:pos="720"/>
+        </w:tabs>
+        <w:ind w:left="720" w:hanging="360"/>
+      </w:pPr>
+    </w:lvl>
+    <w:lvl w:ilvl="1" w:tentative="1">
+      <w:start w:val="1"/>
+      <w:numFmt w:val="decimal"/>
+      <w:lvlText w:val="%2."/>
+      <w:lvlJc w:val="left"/>
+      <w:pPr>
+        <w:tabs>
+          <w:tab w:val="num" w:pos="1440"/>
+        </w:tabs>
+        <w:ind w:left="1440" w:hanging="360"/>
+      </w:pPr>
+    </w:lvl>
+    <w:lvl w:ilvl="2" w:tentative="1">
+      <w:start w:val="1"/>
+      <w:numFmt w:val="decimal"/>
+      <w:lvlText w:val="%3."/>
+      <w:lvlJc w:val="left"/>
+      <w:pPr>
+        <w:tabs>
+          <w:tab w:val="num" w:pos="2160"/>
+        </w:tabs>
+        <w:ind w:left="2160" w:hanging="360"/>
+      </w:pPr>
+    </w:lvl>
+    <w:lvl w:ilvl="3" w:tentative="1">
+      <w:start w:val="1"/>
+      <w:numFmt w:val="decimal"/>
+      <w:lvlText w:val="%4."/>
+      <w:lvlJc w:val="left"/>
+      <w:pPr>
+        <w:tabs>
+          <w:tab w:val="num" w:pos="2880"/>
+        </w:tabs>
+        <w:ind w:left="2880" w:hanging="360"/>
+      </w:pPr>
+    </w:lvl>
+    <w:lvl w:ilvl="4" w:tentative="1">
+      <w:start w:val="1"/>
+      <w:numFmt w:val="decimal"/>
+      <w:lvlText w:val="%5."/>
+      <w:lvlJc w:val="left"/>
+      <w:pPr>
+        <w:tabs>
+          <w:tab w:val="num" w:pos="3600"/>
+        </w:tabs>
+        <w:ind w:left="3600" w:hanging="360"/>
+      </w:pPr>
+    </w:lvl>
+    <w:lvl w:ilvl="5" w:tentative="1">
+      <w:start w:val="1"/>
+      <w:numFmt w:val="decimal"/>
+      <w:lvlText w:val="%6."/>
+      <w:lvlJc w:val="left"/>
+      <w:pPr>
+        <w:tabs>
+          <w:tab w:val="num" w:pos="4320"/>
+        </w:tabs>
+        <w:ind w:left="4320" w:hanging="360"/>
+      </w:pPr>
+    </w:lvl>
+    <w:lvl w:ilvl="6" w:tentative="1">
+      <w:start w:val="1"/>
+      <w:numFmt w:val="decimal"/>
+      <w:lvlText w:val="%7."/>
+      <w:lvlJc w:val="left"/>
+      <w:pPr>
+        <w:tabs>
+          <w:tab w:val="num" w:pos="5040"/>
+        </w:tabs>
+        <w:ind w:left="5040" w:hanging="360"/>
+      </w:pPr>
+    </w:lvl>
+    <w:lvl w:ilvl="7" w:tentative="1">
+      <w:start w:val="1"/>
+      <w:numFmt w:val="decimal"/>
+      <w:lvlText w:val="%8."/>
+      <w:lvlJc w:val="left"/>
+      <w:pPr>
+        <w:tabs>
+          <w:tab w:val="num" w:pos="5760"/>
+        </w:tabs>
+        <w:ind w:left="5760" w:hanging="360"/>
+      </w:pPr>
+    </w:lvl>
+    <w:lvl w:ilvl="8" w:tentative="1">
+      <w:start w:val="1"/>
+      <w:numFmt w:val="decimal"/>
+      <w:lvlText w:val="%9."/>
+      <w:lvlJc w:val="left"/>
+      <w:pPr>
+        <w:tabs>
+          <w:tab w:val="num" w:pos="6480"/>
+        </w:tabs>
+        <w:ind w:left="6480" w:hanging="360"/>
+      </w:pPr>
+    </w:lvl>
+  </w:abstractNum>
+  <w:abstractNum w:abstractNumId="4" w15:restartNumberingAfterBreak="0">
+    <w:nsid w:val="26611557"/>
+    <w:multiLevelType w:val="multilevel"/>
+    <w:tmpl w:val="D5465534"/>
+    <w:lvl w:ilvl="0">
+      <w:start w:val="1"/>
+      <w:numFmt w:val="bullet"/>
+      <w:lvlText w:val=""/>
+      <w:lvlJc w:val="left"/>
+      <w:pPr>
+        <w:tabs>
+          <w:tab w:val="num" w:pos="720"/>
+        </w:tabs>
+        <w:ind w:left="720" w:hanging="360"/>
+      </w:pPr>
+      <w:rPr>
+        <w:rFonts w:ascii="Symbol" w:hAnsi="Symbol" w:hint="default"/>
+        <w:sz w:val="20"/>
+      </w:rPr>
+    </w:lvl>
+    <w:lvl w:ilvl="1" w:tentative="1">
+      <w:start w:val="1"/>
+      <w:numFmt w:val="bullet"/>
+      <w:lvlText w:val="o"/>
+      <w:lvlJc w:val="left"/>
+      <w:pPr>
+        <w:tabs>
+          <w:tab w:val="num" w:pos="1440"/>
+        </w:tabs>
+        <w:ind w:left="1440" w:hanging="360"/>
+      </w:pPr>
+      <w:rPr>
+        <w:rFonts w:ascii="Courier New" w:hAnsi="Courier New" w:hint="default"/>
+        <w:sz w:val="20"/>
+      </w:rPr>
+    </w:lvl>
+    <w:lvl w:ilvl="2" w:tentative="1">
+      <w:start w:val="1"/>
+      <w:numFmt w:val="bullet"/>
+      <w:lvlText w:val=""/>
+      <w:lvlJc w:val="left"/>
+      <w:pPr>
+        <w:tabs>
+          <w:tab w:val="num" w:pos="2160"/>
+        </w:tabs>
+        <w:ind w:left="2160" w:hanging="360"/>
+      </w:pPr>
+      <w:rPr>
+        <w:rFonts w:ascii="Wingdings" w:hAnsi="Wingdings" w:hint="default"/>
+        <w:sz w:val="20"/>
+      </w:rPr>
+    </w:lvl>
+    <w:lvl w:ilvl="3" w:tentative="1">
+      <w:start w:val="1"/>
+      <w:numFmt w:val="bullet"/>
+      <w:lvlText w:val=""/>
+      <w:lvlJc w:val="left"/>
+      <w:pPr>
+        <w:tabs>
+          <w:tab w:val="num" w:pos="2880"/>
+        </w:tabs>
+        <w:ind w:left="2880" w:hanging="360"/>
+      </w:pPr>
+      <w:rPr>
+        <w:rFonts w:ascii="Wingdings" w:hAnsi="Wingdings" w:hint="default"/>
+        <w:sz w:val="20"/>
+      </w:rPr>
+    </w:lvl>
+    <w:lvl w:ilvl="4" w:tentative="1">
+      <w:start w:val="1"/>
+      <w:numFmt w:val="bullet"/>
+      <w:lvlText w:val=""/>
+      <w:lvlJc w:val="left"/>
+      <w:pPr>
+        <w:tabs>
+          <w:tab w:val="num" w:pos="3600"/>
+        </w:tabs>
+        <w:ind w:left="3600" w:hanging="360"/>
+      </w:pPr>
+      <w:rPr>
+        <w:rFonts w:ascii="Wingdings" w:hAnsi="Wingdings" w:hint="default"/>
+        <w:sz w:val="20"/>
+      </w:rPr>
+    </w:lvl>
+    <w:lvl w:ilvl="5" w:tentative="1">
+      <w:start w:val="1"/>
+      <w:numFmt w:val="bullet"/>
+      <w:lvlText w:val=""/>
+      <w:lvlJc w:val="left"/>
+      <w:pPr>
+        <w:tabs>
+          <w:tab w:val="num" w:pos="4320"/>
+        </w:tabs>
+        <w:ind w:left="4320" w:hanging="360"/>
+      </w:pPr>
+      <w:rPr>
+        <w:rFonts w:ascii="Wingdings" w:hAnsi="Wingdings" w:hint="default"/>
+        <w:sz w:val="20"/>
+      </w:rPr>
+    </w:lvl>
+    <w:lvl w:ilvl="6" w:tentative="1">
+      <w:start w:val="1"/>
+      <w:numFmt w:val="bullet"/>
+      <w:lvlText w:val=""/>
+      <w:lvlJc w:val="left"/>
+      <w:pPr>
+        <w:tabs>
+          <w:tab w:val="num" w:pos="5040"/>
+        </w:tabs>
+        <w:ind w:left="5040" w:hanging="360"/>
+      </w:pPr>
+      <w:rPr>
+        <w:rFonts w:ascii="Wingdings" w:hAnsi="Wingdings" w:hint="default"/>
+        <w:sz w:val="20"/>
+      </w:rPr>
+    </w:lvl>
+    <w:lvl w:ilvl="7" w:tentative="1">
+      <w:start w:val="1"/>
+      <w:numFmt w:val="bullet"/>
+      <w:lvlText w:val=""/>
+      <w:lvlJc w:val="left"/>
+      <w:pPr>
+        <w:tabs>
+          <w:tab w:val="num" w:pos="5760"/>
+        </w:tabs>
+        <w:ind w:left="5760" w:hanging="360"/>
+      </w:pPr>
+      <w:rPr>
+        <w:rFonts w:ascii="Wingdings" w:hAnsi="Wingdings" w:hint="default"/>
+        <w:sz w:val="20"/>
+      </w:rPr>
+    </w:lvl>
+    <w:lvl w:ilvl="8" w:tentative="1">
+      <w:start w:val="1"/>
+      <w:numFmt w:val="bullet"/>
+      <w:lvlText w:val=""/>
+      <w:lvlJc w:val="left"/>
+      <w:pPr>
+        <w:tabs>
+          <w:tab w:val="num" w:pos="6480"/>
+        </w:tabs>
+        <w:ind w:left="6480" w:hanging="360"/>
+      </w:pPr>
+      <w:rPr>
+        <w:rFonts w:ascii="Wingdings" w:hAnsi="Wingdings" w:hint="default"/>
+        <w:sz w:val="20"/>
+      </w:rPr>
+    </w:lvl>
+  </w:abstractNum>
+  <w:abstractNum w:abstractNumId="5" w15:restartNumberingAfterBreak="0">
+    <w:nsid w:val="2CC245C3"/>
+    <w:multiLevelType w:val="multilevel"/>
+    <w:tmpl w:val="00E6ADF2"/>
+    <w:lvl w:ilvl="0">
+      <w:start w:val="1"/>
+      <w:numFmt w:val="bullet"/>
+      <w:lvlText w:val=""/>
+      <w:lvlJc w:val="left"/>
+      <w:pPr>
+        <w:tabs>
+          <w:tab w:val="num" w:pos="720"/>
+        </w:tabs>
+        <w:ind w:left="720" w:hanging="360"/>
+      </w:pPr>
+      <w:rPr>
+        <w:rFonts w:ascii="Symbol" w:hAnsi="Symbol" w:hint="default"/>
+        <w:sz w:val="20"/>
+      </w:rPr>
+    </w:lvl>
+    <w:lvl w:ilvl="1" w:tentative="1">
+      <w:start w:val="1"/>
+      <w:numFmt w:val="bullet"/>
+      <w:lvlText w:val="o"/>
+      <w:lvlJc w:val="left"/>
+      <w:pPr>
+        <w:tabs>
+          <w:tab w:val="num" w:pos="1440"/>
+        </w:tabs>
+        <w:ind w:left="1440" w:hanging="360"/>
+      </w:pPr>
+      <w:rPr>
+        <w:rFonts w:ascii="Courier New" w:hAnsi="Courier New" w:hint="default"/>
+        <w:sz w:val="20"/>
+      </w:rPr>
+    </w:lvl>
+    <w:lvl w:ilvl="2" w:tentative="1">
+      <w:start w:val="1"/>
+      <w:numFmt w:val="bullet"/>
+      <w:lvlText w:val=""/>
+      <w:lvlJc w:val="left"/>
+      <w:pPr>
+        <w:tabs>
+          <w:tab w:val="num" w:pos="2160"/>
+        </w:tabs>
+        <w:ind w:left="2160" w:hanging="360"/>
+      </w:pPr>
+      <w:rPr>
+        <w:rFonts w:ascii="Wingdings" w:hAnsi="Wingdings" w:hint="default"/>
+        <w:sz w:val="20"/>
+      </w:rPr>
+    </w:lvl>
+    <w:lvl w:ilvl="3" w:tentative="1">
+      <w:start w:val="1"/>
+      <w:numFmt w:val="bullet"/>
+      <w:lvlText w:val=""/>
+      <w:lvlJc w:val="left"/>
+      <w:pPr>
+        <w:tabs>
+          <w:tab w:val="num" w:pos="2880"/>
+        </w:tabs>
+        <w:ind w:left="2880" w:hanging="360"/>
+      </w:pPr>
+      <w:rPr>
+        <w:rFonts w:ascii="Wingdings" w:hAnsi="Wingdings" w:hint="default"/>
+        <w:sz w:val="20"/>
+      </w:rPr>
+    </w:lvl>
+    <w:lvl w:ilvl="4" w:tentative="1">
+      <w:start w:val="1"/>
+      <w:numFmt w:val="bullet"/>
+      <w:lvlText w:val=""/>
+      <w:lvlJc w:val="left"/>
+      <w:pPr>
+        <w:tabs>
+          <w:tab w:val="num" w:pos="3600"/>
+        </w:tabs>
+        <w:ind w:left="3600" w:hanging="360"/>
+      </w:pPr>
+      <w:rPr>
+        <w:rFonts w:ascii="Wingdings" w:hAnsi="Wingdings" w:hint="default"/>
+        <w:sz w:val="20"/>
+      </w:rPr>
+    </w:lvl>
+    <w:lvl w:ilvl="5" w:tentative="1">
+      <w:start w:val="1"/>
+      <w:numFmt w:val="bullet"/>
+      <w:lvlText w:val=""/>
+      <w:lvlJc w:val="left"/>
+      <w:pPr>
+        <w:tabs>
+          <w:tab w:val="num" w:pos="4320"/>
+        </w:tabs>
+        <w:ind w:left="4320" w:hanging="360"/>
+      </w:pPr>
+      <w:rPr>
+        <w:rFonts w:ascii="Wingdings" w:hAnsi="Wingdings" w:hint="default"/>
+        <w:sz w:val="20"/>
+      </w:rPr>
+    </w:lvl>
+    <w:lvl w:ilvl="6" w:tentative="1">
+      <w:start w:val="1"/>
+      <w:numFmt w:val="bullet"/>
+      <w:lvlText w:val=""/>
+      <w:lvlJc w:val="left"/>
+      <w:pPr>
+        <w:tabs>
+          <w:tab w:val="num" w:pos="5040"/>
+        </w:tabs>
+        <w:ind w:left="5040" w:hanging="360"/>
+      </w:pPr>
+      <w:rPr>
+        <w:rFonts w:ascii="Wingdings" w:hAnsi="Wingdings" w:hint="default"/>
+        <w:sz w:val="20"/>
+      </w:rPr>
+    </w:lvl>
+    <w:lvl w:ilvl="7" w:tentative="1">
+      <w:start w:val="1"/>
+      <w:numFmt w:val="bullet"/>
+      <w:lvlText w:val=""/>
+      <w:lvlJc w:val="left"/>
+      <w:pPr>
+        <w:tabs>
+          <w:tab w:val="num" w:pos="5760"/>
+        </w:tabs>
+        <w:ind w:left="5760" w:hanging="360"/>
+      </w:pPr>
+      <w:rPr>
+        <w:rFonts w:ascii="Wingdings" w:hAnsi="Wingdings" w:hint="default"/>
+        <w:sz w:val="20"/>
+      </w:rPr>
+    </w:lvl>
+    <w:lvl w:ilvl="8" w:tentative="1">
+      <w:start w:val="1"/>
+      <w:numFmt w:val="bullet"/>
+      <w:lvlText w:val=""/>
+      <w:lvlJc w:val="left"/>
+      <w:pPr>
+        <w:tabs>
+          <w:tab w:val="num" w:pos="6480"/>
+        </w:tabs>
+        <w:ind w:left="6480" w:hanging="360"/>
+      </w:pPr>
+      <w:rPr>
+        <w:rFonts w:ascii="Wingdings" w:hAnsi="Wingdings" w:hint="default"/>
+        <w:sz w:val="20"/>
+      </w:rPr>
+    </w:lvl>
+  </w:abstractNum>
+  <w:abstractNum w:abstractNumId="6" w15:restartNumberingAfterBreak="0">
     <w:nsid w:val="416F78DA"/>
     <w:multiLevelType w:val="multilevel"/>
     <w:tmpl w:val="50F2B4CE"/>
@@ -613,7 +5242,25 @@
     </w:lvl>
   </w:abstractNum>
   <w:num w:numId="1" w16cid:durableId="1923709670">
+    <w:abstractNumId w:val="6"/>
+  </w:num>
+  <w:num w:numId="2" w16cid:durableId="59376347">
+    <w:abstractNumId w:val="1"/>
+  </w:num>
+  <w:num w:numId="3" w16cid:durableId="414522004">
+    <w:abstractNumId w:val="4"/>
+  </w:num>
+  <w:num w:numId="4" w16cid:durableId="2038501781">
     <w:abstractNumId w:val="0"/>
+  </w:num>
+  <w:num w:numId="5" w16cid:durableId="1313752732">
+    <w:abstractNumId w:val="5"/>
+  </w:num>
+  <w:num w:numId="6" w16cid:durableId="918172586">
+    <w:abstractNumId w:val="3"/>
+  </w:num>
+  <w:num w:numId="7" w16cid:durableId="1397049887">
+    <w:abstractNumId w:val="2"/>
   </w:num>
 </w:numbering>
 </file>
@@ -1046,7 +5693,6 @@
     <w:next w:val="Normal"/>
     <w:link w:val="Heading2Char"/>
     <w:uiPriority w:val="9"/>
-    <w:semiHidden/>
     <w:unhideWhenUsed/>
     <w:qFormat/>
     <w:rsid w:val="00DB689F"/>
@@ -1262,7 +5908,6 @@
     <w:basedOn w:val="DefaultParagraphFont"/>
     <w:link w:val="Heading2"/>
     <w:uiPriority w:val="9"/>
-    <w:semiHidden/>
     <w:rsid w:val="00DB689F"/>
     <w:rPr>
       <w:rFonts w:asciiTheme="majorHAnsi" w:eastAsiaTheme="majorEastAsia" w:hAnsiTheme="majorHAnsi" w:cstheme="majorBidi"/>

</xml_diff>